<commit_message>
feat: implement exploratory and bivariate analysis notebook with comprehensive statistical validation and visualization outputs
</commit_message>
<xml_diff>
--- a/Documentos_organizacao/Plano_Artigo_Mineracao_Pedro_Dias_Soares.docx
+++ b/Documentos_organizacao/Plano_Artigo_Mineracao_Pedro_Dias_Soares.docx
@@ -117,27 +117,7 @@
                 <w:sz w:val="20"/>
                 <w:szCs w:val="20"/>
               </w:rPr>
-              <w:t xml:space="preserve">Instituição / Orientador(a): Pontifícia Universidade Católica de Minas Gerais — Prof. Dr. </w:t>
-            </w:r>
-            <w:proofErr w:type="spellStart"/>
-            <w:r>
-              <w:rPr>
-                <w:b/>
-                <w:bCs/>
-                <w:sz w:val="20"/>
-                <w:szCs w:val="20"/>
-              </w:rPr>
-              <w:t>Luis</w:t>
-            </w:r>
-            <w:proofErr w:type="spellEnd"/>
-            <w:r>
-              <w:rPr>
-                <w:b/>
-                <w:bCs/>
-                <w:sz w:val="20"/>
-                <w:szCs w:val="20"/>
-              </w:rPr>
-              <w:t xml:space="preserve"> Enrique Zárate</w:t>
+              <w:t>Instituição / Orientador(a): Pontifícia Universidade Católica de Minas Gerais — Prof. Dr. Luis Enrique Zárate</w:t>
             </w:r>
           </w:p>
         </w:tc>
@@ -193,65 +173,8 @@
                 <w:sz w:val="20"/>
                 <w:szCs w:val="20"/>
               </w:rPr>
-              <w:t xml:space="preserve">Periódico-Alvo pretendido: </w:t>
-            </w:r>
-            <w:proofErr w:type="spellStart"/>
-            <w:r>
-              <w:rPr>
-                <w:sz w:val="20"/>
-                <w:szCs w:val="20"/>
-              </w:rPr>
-              <w:t>Journal</w:t>
-            </w:r>
-            <w:proofErr w:type="spellEnd"/>
-            <w:r>
-              <w:rPr>
-                <w:sz w:val="20"/>
-                <w:szCs w:val="20"/>
-              </w:rPr>
-              <w:t xml:space="preserve"> </w:t>
-            </w:r>
-            <w:proofErr w:type="spellStart"/>
-            <w:r>
-              <w:rPr>
-                <w:sz w:val="20"/>
-                <w:szCs w:val="20"/>
-              </w:rPr>
-              <w:t>of</w:t>
-            </w:r>
-            <w:proofErr w:type="spellEnd"/>
-            <w:r>
-              <w:rPr>
-                <w:sz w:val="20"/>
-                <w:szCs w:val="20"/>
-              </w:rPr>
-              <w:t xml:space="preserve"> Health </w:t>
-            </w:r>
-            <w:proofErr w:type="spellStart"/>
-            <w:r>
-              <w:rPr>
-                <w:sz w:val="20"/>
-                <w:szCs w:val="20"/>
-              </w:rPr>
-              <w:t>Informatics</w:t>
-            </w:r>
-            <w:proofErr w:type="spellEnd"/>
-            <w:r>
-              <w:rPr>
-                <w:sz w:val="20"/>
-                <w:szCs w:val="20"/>
-              </w:rPr>
-              <w:t xml:space="preserve"> (JHI) / SBBD Companion </w:t>
-            </w:r>
-            <w:proofErr w:type="spellStart"/>
-            <w:r>
-              <w:rPr>
-                <w:sz w:val="20"/>
-                <w:szCs w:val="20"/>
-              </w:rPr>
-              <w:t>Proceedings</w:t>
-            </w:r>
-            <w:proofErr w:type="spellEnd"/>
+              <w:t>Periódico-Alvo pretendido: Journal of Health Informatics (JHI) / SBBD Companion Proceedings</w:t>
+            </w:r>
           </w:p>
         </w:tc>
       </w:tr>
@@ -513,23 +436,21 @@
                 <w:sz w:val="20"/>
                 <w:szCs w:val="20"/>
               </w:rPr>
-              <w:t>O impacto do padrão alimentar no agravamento da Artrite e Reumatismo. Há uma necessidade de entender como o consumo de ultraprocessados e a falta de alimentos in natura se relacionam com a inflamação sistêmica nesta população específica. Estudos prévios da linha de pesquisa (</w:t>
-            </w:r>
-            <w:proofErr w:type="spellStart"/>
+              <w:t xml:space="preserve">O impacto do padrão alimentar no agravamento da Artrite e Reumatismo. Há uma necessidade de entender como o consumo de ultraprocessados e a falta de alimentos </w:t>
+            </w:r>
             <w:r>
               <w:rPr>
                 <w:sz w:val="20"/>
                 <w:szCs w:val="20"/>
               </w:rPr>
-              <w:t>Cancella</w:t>
-            </w:r>
-            <w:proofErr w:type="spellEnd"/>
+              <w:t>não processados</w:t>
+            </w:r>
             <w:r>
               <w:rPr>
                 <w:sz w:val="20"/>
                 <w:szCs w:val="20"/>
               </w:rPr>
-              <w:t xml:space="preserve"> &amp; Zárate, 2025) já identificaram que fatores como sexo, presença de diabetes e autopercepção de saúde são relevantes para o perfil artrite-depressão em idosos, mas a dimensão nutricional permanece subexplorada.</w:t>
+              <w:t xml:space="preserve"> se relacionam com a inflamação sistêmica nesta população específica. Estudos prévios da linha de pesquisa (Cancella &amp; Zárate, 2025) já identificaram que fatores como sexo, presença de diabetes e autopercepção de saúde são relevantes para o perfil artrite-depressão em idosos, mas a dimensão nutricional permanece subexplorada.</w:t>
             </w:r>
           </w:p>
         </w:tc>
@@ -758,7 +679,7 @@
                 <w:sz w:val="20"/>
                 <w:szCs w:val="20"/>
               </w:rPr>
-              <w:t>Por que este tema merece ser publicado? (originalidade e relevância)</w:t>
+              <w:t>Por que este tema merece ser publicado?</w:t>
             </w:r>
           </w:p>
         </w:tc>
@@ -1040,7 +961,25 @@
                 <w:sz w:val="20"/>
                 <w:szCs w:val="20"/>
               </w:rPr>
-              <w:t>Rascunho do Objetivo Principal (versão 1):</w:t>
+              <w:t xml:space="preserve">Rascunho do Objetivo Principal (versão </w:t>
+            </w:r>
+            <w:r>
+              <w:rPr>
+                <w:b/>
+                <w:bCs/>
+                <w:sz w:val="20"/>
+                <w:szCs w:val="20"/>
+              </w:rPr>
+              <w:t>3</w:t>
+            </w:r>
+            <w:r>
+              <w:rPr>
+                <w:b/>
+                <w:bCs/>
+                <w:sz w:val="20"/>
+                <w:szCs w:val="20"/>
+              </w:rPr>
+              <w:t>):</w:t>
             </w:r>
           </w:p>
         </w:tc>
@@ -1160,121 +1099,62 @@
               </w:rPr>
               <w:t>1. Mapear hábitos alimentares preditores (consumo de ultraprocessados, açúcar, alimentos in natura) extraídos da PNS 2019 via método CAPTO.</w:t>
             </w:r>
-          </w:p>
-          <w:p>
-            <w:pPr>
-              <w:spacing w:before="40" w:after="40"/>
-            </w:pPr>
             <w:r>
               <w:rPr>
                 <w:sz w:val="20"/>
                 <w:szCs w:val="20"/>
               </w:rPr>
-              <w:t xml:space="preserve">2. Classificar os indivíduos entre perfil Saudável e perfil Portador de Artrite usando algoritmos de Aprendizado de Máquina Supervisionado (Árvore de Decisão, Floresta Aleatória, </w:t>
-            </w:r>
-            <w:proofErr w:type="spellStart"/>
+              <w:br/>
+            </w:r>
+          </w:p>
+          <w:p>
+            <w:pPr>
+              <w:spacing w:before="40" w:after="40"/>
+            </w:pPr>
             <w:r>
               <w:rPr>
                 <w:sz w:val="20"/>
                 <w:szCs w:val="20"/>
               </w:rPr>
-              <w:t>Naive</w:t>
-            </w:r>
-            <w:proofErr w:type="spellEnd"/>
+              <w:t>2. Classificar os indivíduos entre perfil Saudável e perfil Portador de Artrite usando algoritmos de Aprendizado de Máquina Supervisionado (Árvore de Decisão, Floresta Aleatória, Naive Bayes, AdaBoost).</w:t>
+            </w:r>
             <w:r>
               <w:rPr>
                 <w:sz w:val="20"/>
                 <w:szCs w:val="20"/>
               </w:rPr>
-              <w:t xml:space="preserve"> </w:t>
-            </w:r>
-            <w:proofErr w:type="spellStart"/>
+              <w:br/>
+            </w:r>
+          </w:p>
+          <w:p>
+            <w:pPr>
+              <w:spacing w:before="40" w:after="40"/>
+            </w:pPr>
             <w:r>
               <w:rPr>
                 <w:sz w:val="20"/>
                 <w:szCs w:val="20"/>
               </w:rPr>
-              <w:t>Bayes</w:t>
-            </w:r>
-            <w:proofErr w:type="spellEnd"/>
+              <w:t>3. Analisar a influência de covariáveis como atividade física, condições físicas/mentais e dados sociodemográficos e antropométricos na classificação do perfil de risco.</w:t>
+            </w:r>
             <w:r>
               <w:rPr>
                 <w:sz w:val="20"/>
                 <w:szCs w:val="20"/>
               </w:rPr>
-              <w:t xml:space="preserve">, </w:t>
-            </w:r>
-            <w:proofErr w:type="spellStart"/>
+              <w:br/>
+            </w:r>
+          </w:p>
+          <w:p>
+            <w:pPr>
+              <w:spacing w:before="40" w:after="40"/>
+            </w:pPr>
             <w:r>
               <w:rPr>
                 <w:sz w:val="20"/>
                 <w:szCs w:val="20"/>
               </w:rPr>
-              <w:t>AdaBoost</w:t>
-            </w:r>
-            <w:proofErr w:type="spellEnd"/>
-            <w:r>
-              <w:rPr>
-                <w:sz w:val="20"/>
-                <w:szCs w:val="20"/>
-              </w:rPr>
-              <w:t>).</w:t>
-            </w:r>
-          </w:p>
-          <w:p>
-            <w:pPr>
-              <w:spacing w:before="40" w:after="40"/>
-            </w:pPr>
-            <w:r>
-              <w:rPr>
-                <w:sz w:val="20"/>
-                <w:szCs w:val="20"/>
-              </w:rPr>
-              <w:t>3. Analisar a influência de covariáveis como atividade física, condições físicas/mentais e dados sociodemográficos e antropométricos na classificação do perfil de risco.</w:t>
-            </w:r>
-          </w:p>
-          <w:p>
-            <w:pPr>
-              <w:spacing w:before="40" w:after="40"/>
-            </w:pPr>
-            <w:r>
-              <w:rPr>
-                <w:sz w:val="20"/>
-                <w:szCs w:val="20"/>
-              </w:rPr>
-              <w:t xml:space="preserve">4. Identificar os atributos de maior importância relativa para a classificação por meio de Feature </w:t>
-            </w:r>
-            <w:proofErr w:type="spellStart"/>
-            <w:r>
-              <w:rPr>
-                <w:sz w:val="20"/>
-                <w:szCs w:val="20"/>
-              </w:rPr>
-              <w:t>Importance</w:t>
-            </w:r>
-            <w:proofErr w:type="spellEnd"/>
-            <w:r>
-              <w:rPr>
-                <w:sz w:val="20"/>
-                <w:szCs w:val="20"/>
-              </w:rPr>
-              <w:t xml:space="preserve"> (</w:t>
-            </w:r>
-            <w:proofErr w:type="spellStart"/>
-            <w:r>
-              <w:rPr>
-                <w:sz w:val="20"/>
-                <w:szCs w:val="20"/>
-              </w:rPr>
-              <w:t>scikit-learn</w:t>
-            </w:r>
-            <w:proofErr w:type="spellEnd"/>
-            <w:r>
-              <w:rPr>
-                <w:sz w:val="20"/>
-                <w:szCs w:val="20"/>
-              </w:rPr>
-              <w:t xml:space="preserve"> / Python).</w:t>
+              <w:t>4. Identificar os atributos de maior importância relativa para a classificação por meio de Feature Importance (scikit-learn / Python).</w:t>
             </w:r>
           </w:p>
         </w:tc>
@@ -1377,53 +1257,12 @@
             </w:tcMar>
           </w:tcPr>
           <w:p>
-            <w:proofErr w:type="spellStart"/>
             <w:r>
               <w:rPr>
                 <w:sz w:val="20"/>
                 <w:szCs w:val="20"/>
               </w:rPr>
-              <w:t>Journal</w:t>
-            </w:r>
-            <w:proofErr w:type="spellEnd"/>
-            <w:r>
-              <w:rPr>
-                <w:sz w:val="20"/>
-                <w:szCs w:val="20"/>
-              </w:rPr>
-              <w:t xml:space="preserve"> </w:t>
-            </w:r>
-            <w:proofErr w:type="spellStart"/>
-            <w:r>
-              <w:rPr>
-                <w:sz w:val="20"/>
-                <w:szCs w:val="20"/>
-              </w:rPr>
-              <w:t>of</w:t>
-            </w:r>
-            <w:proofErr w:type="spellEnd"/>
-            <w:r>
-              <w:rPr>
-                <w:sz w:val="20"/>
-                <w:szCs w:val="20"/>
-              </w:rPr>
-              <w:t xml:space="preserve"> Health </w:t>
-            </w:r>
-            <w:proofErr w:type="spellStart"/>
-            <w:r>
-              <w:rPr>
-                <w:sz w:val="20"/>
-                <w:szCs w:val="20"/>
-              </w:rPr>
-              <w:t>Informatics</w:t>
-            </w:r>
-            <w:proofErr w:type="spellEnd"/>
-            <w:r>
-              <w:rPr>
-                <w:sz w:val="20"/>
-                <w:szCs w:val="20"/>
-              </w:rPr>
-              <w:t xml:space="preserve"> (JHI / SBIS) — mesmo periódico dos trabalhos de referência da linha de pesquisa (ISSN: 2175-4411)</w:t>
+              <w:t>Journal of Health Informatics (JHI / SBIS) — mesmo periódico dos trabalhos de referência da linha de pesquisa (ISSN: 2175-4411)</w:t>
             </w:r>
           </w:p>
         </w:tc>
@@ -1622,68 +1461,10 @@
           <w:sz w:val="26"/>
           <w:szCs w:val="26"/>
         </w:rPr>
+        <w:lastRenderedPageBreak/>
         <w:t>📊  FASE 1 — MONTE AS TABELAS E FIGURAS</w:t>
       </w:r>
     </w:p>
-    <w:p>
-      <w:pPr>
-        <w:spacing w:before="60" w:after="60"/>
-      </w:pPr>
-    </w:p>
-    <w:tbl>
-      <w:tblPr>
-        <w:tblW w:w="9360" w:type="dxa"/>
-        <w:tblBorders>
-          <w:top w:val="single" w:sz="4" w:space="0" w:color="auto"/>
-          <w:left w:val="single" w:sz="4" w:space="0" w:color="auto"/>
-          <w:bottom w:val="single" w:sz="4" w:space="0" w:color="auto"/>
-          <w:right w:val="single" w:sz="4" w:space="0" w:color="auto"/>
-          <w:insideH w:val="single" w:sz="4" w:space="0" w:color="auto"/>
-          <w:insideV w:val="single" w:sz="4" w:space="0" w:color="auto"/>
-        </w:tblBorders>
-        <w:tblCellMar>
-          <w:left w:w="10" w:type="dxa"/>
-          <w:right w:w="10" w:type="dxa"/>
-        </w:tblCellMar>
-        <w:tblLook w:val="0000" w:firstRow="0" w:lastRow="0" w:firstColumn="0" w:lastColumn="0" w:noHBand="0" w:noVBand="0"/>
-      </w:tblPr>
-      <w:tblGrid>
-        <w:gridCol w:w="9360"/>
-      </w:tblGrid>
-      <w:tr>
-        <w:tc>
-          <w:tcPr>
-            <w:tcW w:w="0" w:type="auto"/>
-            <w:tcBorders>
-              <w:top w:val="single" w:sz="1" w:space="0" w:color="AAAAAA"/>
-              <w:left w:val="single" w:sz="1" w:space="0" w:color="AAAAAA"/>
-              <w:bottom w:val="single" w:sz="1" w:space="0" w:color="AAAAAA"/>
-              <w:right w:val="single" w:sz="1" w:space="0" w:color="AAAAAA"/>
-            </w:tcBorders>
-            <w:shd w:val="clear" w:color="auto" w:fill="FFF2CC"/>
-            <w:tcMar>
-              <w:top w:w="80" w:type="dxa"/>
-              <w:left w:w="160" w:type="dxa"/>
-              <w:bottom w:w="80" w:type="dxa"/>
-              <w:right w:w="160" w:type="dxa"/>
-            </w:tcMar>
-          </w:tcPr>
-          <w:p>
-            <w:r>
-              <w:rPr>
-                <w:i/>
-                <w:iCs/>
-                <w:color w:val="7D6608"/>
-                <w:sz w:val="20"/>
-                <w:szCs w:val="20"/>
-              </w:rPr>
-              <w:lastRenderedPageBreak/>
-              <w:t>💡 A escrita começa pelas ilustrações, não pelo texto. Organize os dados antes de escrever qualquer seção. Baseie-se nos gráficos de importância de atributos e métricas dos modelos como feito nos artigos de referência.</w:t>
-            </w:r>
-          </w:p>
-        </w:tc>
-      </w:tr>
-    </w:tbl>
     <w:p>
       <w:pPr>
         <w:spacing w:before="80" w:after="80"/>
@@ -2044,39 +1825,7 @@
                 <w:sz w:val="20"/>
                 <w:szCs w:val="20"/>
               </w:rPr>
-              <w:t xml:space="preserve">Distribuição das classes após balanceamento (Random </w:t>
-            </w:r>
-            <w:proofErr w:type="spellStart"/>
-            <w:r>
-              <w:rPr>
-                <w:sz w:val="20"/>
-                <w:szCs w:val="20"/>
-              </w:rPr>
-              <w:t>Under</w:t>
-            </w:r>
-            <w:proofErr w:type="spellEnd"/>
-            <w:r>
-              <w:rPr>
-                <w:sz w:val="20"/>
-                <w:szCs w:val="20"/>
-              </w:rPr>
-              <w:t xml:space="preserve"> </w:t>
-            </w:r>
-            <w:proofErr w:type="spellStart"/>
-            <w:r>
-              <w:rPr>
-                <w:sz w:val="20"/>
-                <w:szCs w:val="20"/>
-              </w:rPr>
-              <w:t>Sampler</w:t>
-            </w:r>
-            <w:proofErr w:type="spellEnd"/>
-            <w:r>
-              <w:rPr>
-                <w:sz w:val="20"/>
-                <w:szCs w:val="20"/>
-              </w:rPr>
-              <w:t>): Saudável vs. Artrite</w:t>
+              <w:t>Distribuição das classes após balanceamento (Random Under Sampler): Saudável vs. Artrite</w:t>
             </w:r>
           </w:p>
         </w:tc>
@@ -2421,33 +2170,8 @@
                 <w:sz w:val="20"/>
                 <w:szCs w:val="20"/>
               </w:rPr>
-              <w:t xml:space="preserve">Importância dos atributos (Feature </w:t>
-            </w:r>
-            <w:proofErr w:type="spellStart"/>
-            <w:r>
-              <w:rPr>
-                <w:sz w:val="20"/>
-                <w:szCs w:val="20"/>
-              </w:rPr>
-              <w:t>Importance</w:t>
-            </w:r>
-            <w:proofErr w:type="spellEnd"/>
-            <w:r>
-              <w:rPr>
-                <w:sz w:val="20"/>
-                <w:szCs w:val="20"/>
-              </w:rPr>
-              <w:t xml:space="preserve">) nos modelos: Árvore de Decisão, Floresta Aleatória e </w:t>
-            </w:r>
-            <w:proofErr w:type="spellStart"/>
-            <w:r>
-              <w:rPr>
-                <w:sz w:val="20"/>
-                <w:szCs w:val="20"/>
-              </w:rPr>
-              <w:t>AdaBoost</w:t>
-            </w:r>
-            <w:proofErr w:type="spellEnd"/>
+              <w:t>Importância dos atributos (Feature Importance) nos modelos: Árvore de Decisão, Floresta Aleatória e AdaBoost</w:t>
+            </w:r>
           </w:p>
         </w:tc>
         <w:tc>
@@ -2504,64 +2228,6 @@
     <w:p>
       <w:pPr>
         <w:spacing w:before="60" w:after="60"/>
-      </w:pPr>
-    </w:p>
-    <w:tbl>
-      <w:tblPr>
-        <w:tblW w:w="9360" w:type="dxa"/>
-        <w:tblBorders>
-          <w:top w:val="single" w:sz="4" w:space="0" w:color="auto"/>
-          <w:left w:val="single" w:sz="4" w:space="0" w:color="auto"/>
-          <w:bottom w:val="single" w:sz="4" w:space="0" w:color="auto"/>
-          <w:right w:val="single" w:sz="4" w:space="0" w:color="auto"/>
-          <w:insideH w:val="single" w:sz="4" w:space="0" w:color="auto"/>
-          <w:insideV w:val="single" w:sz="4" w:space="0" w:color="auto"/>
-        </w:tblBorders>
-        <w:tblCellMar>
-          <w:left w:w="10" w:type="dxa"/>
-          <w:right w:w="10" w:type="dxa"/>
-        </w:tblCellMar>
-        <w:tblLook w:val="0000" w:firstRow="0" w:lastRow="0" w:firstColumn="0" w:lastColumn="0" w:noHBand="0" w:noVBand="0"/>
-      </w:tblPr>
-      <w:tblGrid>
-        <w:gridCol w:w="9360"/>
-      </w:tblGrid>
-      <w:tr>
-        <w:tc>
-          <w:tcPr>
-            <w:tcW w:w="0" w:type="auto"/>
-            <w:tcBorders>
-              <w:top w:val="single" w:sz="1" w:space="0" w:color="AAAAAA"/>
-              <w:left w:val="single" w:sz="1" w:space="0" w:color="AAAAAA"/>
-              <w:bottom w:val="single" w:sz="1" w:space="0" w:color="AAAAAA"/>
-              <w:right w:val="single" w:sz="1" w:space="0" w:color="AAAAAA"/>
-            </w:tcBorders>
-            <w:shd w:val="clear" w:color="auto" w:fill="FFF2CC"/>
-            <w:tcMar>
-              <w:top w:w="80" w:type="dxa"/>
-              <w:left w:w="160" w:type="dxa"/>
-              <w:bottom w:w="80" w:type="dxa"/>
-              <w:right w:w="160" w:type="dxa"/>
-            </w:tcMar>
-          </w:tcPr>
-          <w:p>
-            <w:r>
-              <w:rPr>
-                <w:i/>
-                <w:iCs/>
-                <w:color w:val="7D6608"/>
-                <w:sz w:val="20"/>
-                <w:szCs w:val="20"/>
-              </w:rPr>
-              <w:t>💡 Descreva como o estudo foi realizado. Deve ser detalhado o suficiente para permitir a replicação, seguindo o modelo dos artigos de referência da linha de pesquisa do orientador.</w:t>
-            </w:r>
-          </w:p>
-        </w:tc>
-      </w:tr>
-    </w:tbl>
-    <w:p>
-      <w:pPr>
-        <w:spacing w:before="80" w:after="80"/>
       </w:pPr>
     </w:p>
     <w:p>
@@ -3210,9 +2876,9 @@
       </w:tblPr>
       <w:tblGrid>
         <w:gridCol w:w="412"/>
-        <w:gridCol w:w="1690"/>
-        <w:gridCol w:w="1967"/>
-        <w:gridCol w:w="5291"/>
+        <w:gridCol w:w="1681"/>
+        <w:gridCol w:w="1951"/>
+        <w:gridCol w:w="5316"/>
       </w:tblGrid>
       <w:tr>
         <w:tc>
@@ -3357,7 +3023,6 @@
                 <w:bCs/>
                 <w:color w:val="1F4E79"/>
               </w:rPr>
-              <w:lastRenderedPageBreak/>
               <w:t>P</w:t>
             </w:r>
           </w:p>
@@ -3561,7 +3226,21 @@
                 <w:sz w:val="20"/>
                 <w:szCs w:val="20"/>
               </w:rPr>
-              <w:t>Padrões nutricionais inflamatórios (consumo de ultraprocessados, açúcar, gorduras saturadas, alimentos in natura) e variáveis sociodemográficas, mentais, físicas e antropométricas associadas.</w:t>
+              <w:t xml:space="preserve">Padrões nutricionais inflamatórios (consumo de ultraprocessados, açúcar, gorduras saturadas, alimentos </w:t>
+            </w:r>
+            <w:r>
+              <w:rPr>
+                <w:sz w:val="20"/>
+                <w:szCs w:val="20"/>
+              </w:rPr>
+              <w:t>não processados</w:t>
+            </w:r>
+            <w:r>
+              <w:rPr>
+                <w:sz w:val="20"/>
+                <w:szCs w:val="20"/>
+              </w:rPr>
+              <w:t>) e variáveis sociodemográficas, mentais, físicas e antropométricas associadas.</w:t>
             </w:r>
           </w:p>
         </w:tc>
@@ -3594,6 +3273,7 @@
                 <w:bCs/>
                 <w:color w:val="1F4E79"/>
               </w:rPr>
+              <w:lastRenderedPageBreak/>
               <w:t>C</w:t>
             </w:r>
           </w:p>
@@ -3741,27 +3421,7 @@
                 <w:sz w:val="20"/>
                 <w:szCs w:val="20"/>
               </w:rPr>
-              <w:t>Desfecho (</w:t>
-            </w:r>
-            <w:proofErr w:type="spellStart"/>
-            <w:r>
-              <w:rPr>
-                <w:b/>
-                <w:bCs/>
-                <w:sz w:val="20"/>
-                <w:szCs w:val="20"/>
-              </w:rPr>
-              <w:t>Outcome</w:t>
-            </w:r>
-            <w:proofErr w:type="spellEnd"/>
-            <w:r>
-              <w:rPr>
-                <w:b/>
-                <w:bCs/>
-                <w:sz w:val="20"/>
-                <w:szCs w:val="20"/>
-              </w:rPr>
-              <w:t>)</w:t>
+              <w:t>Desfecho (Outcome)</w:t>
             </w:r>
           </w:p>
         </w:tc>
@@ -3990,7 +3650,28 @@
                 <w:sz w:val="20"/>
                 <w:szCs w:val="20"/>
               </w:rPr>
-              <w:t>Pergunta de pesquisa completa: Quais padrões nutricionais e características sociodemográficas diferenciam idosos com artrite e reumatismo de idosos saudáveis no Brasil, segundo dados da PNS 2019, através da aplicação de algoritmos de aprendizado de máquina supervisionado?</w:t>
+              <w:t xml:space="preserve">Pergunta de pesquisa completa: </w:t>
+            </w:r>
+            <w:r>
+              <w:rPr>
+                <w:sz w:val="20"/>
+                <w:szCs w:val="20"/>
+              </w:rPr>
+              <w:br/>
+            </w:r>
+            <w:r>
+              <w:rPr>
+                <w:sz w:val="20"/>
+                <w:szCs w:val="20"/>
+              </w:rPr>
+              <w:br/>
+            </w:r>
+            <w:r>
+              <w:rPr>
+                <w:sz w:val="20"/>
+                <w:szCs w:val="20"/>
+              </w:rPr>
+              <w:t>Quais padrões nutricionais e características sociodemográficas diferenciam idosos com artrite e reumatismo de idosos saudáveis no Brasil, segundo dados da PNS 2019, através da aplicação de algoritmos de aprendizado de máquina supervisionado?</w:t>
             </w:r>
           </w:p>
         </w:tc>
@@ -4118,7 +3799,21 @@
                 <w:sz w:val="20"/>
                 <w:szCs w:val="20"/>
               </w:rPr>
-              <w:t>Microdados de domínio público da Pesquisa Nacional de Saúde (PNS) conduzida em 2019 pelo IBGE em parceria com o Ministério da Saúde. Aprovada pela CONEP, parecer 3.529.376 de Agosto de 2019.</w:t>
+              <w:t xml:space="preserve">Microdados de domínio público da Pesquisa Nacional de Saúde (PNS) conduzida em 2019 pelo IBGE em parceria com o Ministério da Saúde. Aprovada pela CONEP, parecer 3.529.376 de </w:t>
+            </w:r>
+            <w:r>
+              <w:rPr>
+                <w:sz w:val="20"/>
+                <w:szCs w:val="20"/>
+              </w:rPr>
+              <w:t>agosto</w:t>
+            </w:r>
+            <w:r>
+              <w:rPr>
+                <w:sz w:val="20"/>
+                <w:szCs w:val="20"/>
+              </w:rPr>
+              <w:t xml:space="preserve"> de 2019.</w:t>
             </w:r>
           </w:p>
         </w:tc>
@@ -4173,7 +3868,28 @@
                 <w:sz w:val="20"/>
                 <w:szCs w:val="20"/>
               </w:rPr>
-              <w:t>Características do cenário: A PNS 2019 analisa a percepção do estado de saúde, estilos de vida, doenças crônicas e saúde bucal da população brasileira. A base original possui 293.726 registros e 1.088 atributos organizados em módulos temáticos. Para este estudo, será realizado um corte analítico voltado para a artrite e reumatismo em idosos (60+ anos), com seleção conceitual de atributos pertinentes às dimensões nutricionais, físicas, mentais e sociodemográficas.</w:t>
+              <w:t xml:space="preserve">Características do cenário: </w:t>
+            </w:r>
+            <w:r>
+              <w:rPr>
+                <w:sz w:val="20"/>
+                <w:szCs w:val="20"/>
+              </w:rPr>
+              <w:br/>
+            </w:r>
+            <w:r>
+              <w:rPr>
+                <w:sz w:val="20"/>
+                <w:szCs w:val="20"/>
+              </w:rPr>
+              <w:br/>
+            </w:r>
+            <w:r>
+              <w:rPr>
+                <w:sz w:val="20"/>
+                <w:szCs w:val="20"/>
+              </w:rPr>
+              <w:t>A PNS 2019 analisa a percepção do estado de saúde, estilos de vida, doenças crônicas e saúde bucal da população brasileira. A base original possui 293.726 registros e 1.088 atributos organizados em módulos temáticos. Para este estudo, será realizado um corte analítico voltado para a artrite e reumatismo em idosos (60+ anos), com seleção conceitual de atributos pertinentes às dimensões nutricionais, físicas, mentais e sociodemográficas.</w:t>
             </w:r>
           </w:p>
         </w:tc>
@@ -4266,7 +3982,7 @@
                 <w:sz w:val="20"/>
                 <w:szCs w:val="20"/>
               </w:rPr>
-              <w:t>• Indivíduos com 60 anos ou mais • Que responderam todos os questionários dos módulos pertinentes da PNS 2019 • Com resposta definida (Sim/Não) para o diagnóstico de artrite/reumatismo (Q030)</w:t>
+              <w:t>• Indivíduos com 60 anos ou mais • Que responderam todos os questionários dos módulos pertinentes da PNS 2019 • Com resposta definida (Sim/Não) para o diagnóstico de artrite/reumatismo</w:t>
             </w:r>
           </w:p>
         </w:tc>
@@ -4307,23 +4023,7 @@
                 <w:sz w:val="20"/>
                 <w:szCs w:val="20"/>
               </w:rPr>
-              <w:t xml:space="preserve">• Indivíduos com idade inferior a 60 anos • Registros com respostas "Ignorado" ou ausentes para as variáveis-alvo • Instâncias com alta proporção de dados ausentes nos atributos nutricionais selecionados (&gt;60% </w:t>
-            </w:r>
-            <w:proofErr w:type="spellStart"/>
-            <w:r>
-              <w:rPr>
-                <w:sz w:val="20"/>
-                <w:szCs w:val="20"/>
-              </w:rPr>
-              <w:t>missing</w:t>
-            </w:r>
-            <w:proofErr w:type="spellEnd"/>
-            <w:r>
-              <w:rPr>
-                <w:sz w:val="20"/>
-                <w:szCs w:val="20"/>
-              </w:rPr>
-              <w:t>)</w:t>
+              <w:t>• Indivíduos com idade inferior a 60 anos • Registros com respostas "Ignorado" ou ausentes para as variáveis-alvo • Instâncias com alta proporção de dados ausentes nos atributos nutricionais selecionados (&gt;60% missing)</w:t>
             </w:r>
           </w:p>
         </w:tc>
@@ -4366,39 +4066,77 @@
                 <w:sz w:val="20"/>
                 <w:szCs w:val="20"/>
               </w:rPr>
-              <w:t xml:space="preserve">Composição de quatro bases de dados específicas: (1) População idosa geral; (2) Idosos saudáveis sem doenças crônicas; (3) Idosos com artrite/reumatismo com comorbidades; (4) Idosos apenas com artrite/reumatismo (artrite pura). Balanceamento via Random </w:t>
-            </w:r>
-            <w:proofErr w:type="spellStart"/>
+              <w:t xml:space="preserve">Composição de quatro bases de dados específicas: </w:t>
+            </w:r>
             <w:r>
               <w:rPr>
                 <w:sz w:val="20"/>
                 <w:szCs w:val="20"/>
               </w:rPr>
-              <w:t>Under</w:t>
-            </w:r>
-            <w:proofErr w:type="spellEnd"/>
+              <w:br/>
+            </w:r>
             <w:r>
               <w:rPr>
                 <w:sz w:val="20"/>
                 <w:szCs w:val="20"/>
               </w:rPr>
-              <w:t xml:space="preserve"> </w:t>
-            </w:r>
-            <w:proofErr w:type="spellStart"/>
+              <w:t xml:space="preserve">(1) População idosa geral; </w:t>
+            </w:r>
             <w:r>
               <w:rPr>
                 <w:sz w:val="20"/>
                 <w:szCs w:val="20"/>
               </w:rPr>
-              <w:t>Sampler</w:t>
-            </w:r>
-            <w:proofErr w:type="spellEnd"/>
+              <w:br/>
+            </w:r>
             <w:r>
               <w:rPr>
                 <w:sz w:val="20"/>
                 <w:szCs w:val="20"/>
               </w:rPr>
-              <w:t xml:space="preserve"> (RUS) aplicado ao conjunto de treino e teste.</w:t>
+              <w:t xml:space="preserve">(2) Idosos saudáveis sem doenças crônicas; </w:t>
+            </w:r>
+            <w:r>
+              <w:rPr>
+                <w:sz w:val="20"/>
+                <w:szCs w:val="20"/>
+              </w:rPr>
+              <w:br/>
+            </w:r>
+            <w:r>
+              <w:rPr>
+                <w:sz w:val="20"/>
+                <w:szCs w:val="20"/>
+              </w:rPr>
+              <w:t xml:space="preserve">(3) Idosos com artrite/reumatismo com comorbidades; </w:t>
+            </w:r>
+            <w:r>
+              <w:rPr>
+                <w:sz w:val="20"/>
+                <w:szCs w:val="20"/>
+              </w:rPr>
+              <w:br/>
+            </w:r>
+            <w:r>
+              <w:rPr>
+                <w:sz w:val="20"/>
+                <w:szCs w:val="20"/>
+              </w:rPr>
+              <w:t xml:space="preserve">(4) Idosos apenas com artrite/reumatismo (artrite pura). </w:t>
+            </w:r>
+            <w:r>
+              <w:rPr>
+                <w:sz w:val="20"/>
+                <w:szCs w:val="20"/>
+              </w:rPr>
+              <w:br/>
+            </w:r>
+            <w:r>
+              <w:rPr>
+                <w:sz w:val="20"/>
+                <w:szCs w:val="20"/>
+              </w:rPr>
+              <w:t>Balanceamento via Random Under Sampler (RUS) aplicado ao conjunto de treino e teste.</w:t>
             </w:r>
           </w:p>
         </w:tc>
@@ -4439,47 +4177,7 @@
                 <w:sz w:val="20"/>
                 <w:szCs w:val="20"/>
               </w:rPr>
-              <w:t>A definir após o corte analítico. Estudos anteriores da mesma base (</w:t>
-            </w:r>
-            <w:proofErr w:type="spellStart"/>
-            <w:r>
-              <w:rPr>
-                <w:sz w:val="20"/>
-                <w:szCs w:val="20"/>
-              </w:rPr>
-              <w:t>Cancella</w:t>
-            </w:r>
-            <w:proofErr w:type="spellEnd"/>
-            <w:r>
-              <w:rPr>
-                <w:sz w:val="20"/>
-                <w:szCs w:val="20"/>
-              </w:rPr>
-              <w:t xml:space="preserve"> &amp; Zárate, 2025) identificaram 1.620 casos de </w:t>
-            </w:r>
-            <w:proofErr w:type="spellStart"/>
-            <w:r>
-              <w:rPr>
-                <w:sz w:val="20"/>
-                <w:szCs w:val="20"/>
-              </w:rPr>
-              <w:t>artrite+depressão</w:t>
-            </w:r>
-            <w:proofErr w:type="spellEnd"/>
-            <w:r>
-              <w:rPr>
-                <w:sz w:val="20"/>
-                <w:szCs w:val="20"/>
-              </w:rPr>
-              <w:t xml:space="preserve"> em indivíduos ≥60 anos. Espera-se volume maior para artrite isolada. Divisão treino/teste: 70/30 com validação cruzada </w:t>
-            </w:r>
-            <w:r>
-              <w:rPr>
-                <w:sz w:val="20"/>
-                <w:szCs w:val="20"/>
-              </w:rPr>
-              <w:lastRenderedPageBreak/>
-              <w:t>de 10-fold (metodologia padrão da linha de pesquisa).</w:t>
+              <w:t>A definir após o corte analítico. Estudos anteriores da mesma base (Cancella &amp; Zárate, 2025) identificaram 1.620 casos de artrite+depressão em indivíduos ≥60 anos. Espera-se volume maior para artrite isolada. Divisão treino/teste: 70/30 com validação cruzada de 10-fold (metodologia padrão da linha de pesquisa).</w:t>
             </w:r>
           </w:p>
         </w:tc>
@@ -4513,59 +4211,6 @@
         <w:spacing w:before="60" w:after="60"/>
       </w:pPr>
     </w:p>
-    <w:tbl>
-      <w:tblPr>
-        <w:tblW w:w="9360" w:type="dxa"/>
-        <w:tblBorders>
-          <w:top w:val="single" w:sz="4" w:space="0" w:color="auto"/>
-          <w:left w:val="single" w:sz="4" w:space="0" w:color="auto"/>
-          <w:bottom w:val="single" w:sz="4" w:space="0" w:color="auto"/>
-          <w:right w:val="single" w:sz="4" w:space="0" w:color="auto"/>
-          <w:insideH w:val="single" w:sz="4" w:space="0" w:color="auto"/>
-          <w:insideV w:val="single" w:sz="4" w:space="0" w:color="auto"/>
-        </w:tblBorders>
-        <w:tblCellMar>
-          <w:left w:w="10" w:type="dxa"/>
-          <w:right w:w="10" w:type="dxa"/>
-        </w:tblCellMar>
-        <w:tblLook w:val="0000" w:firstRow="0" w:lastRow="0" w:firstColumn="0" w:lastColumn="0" w:noHBand="0" w:noVBand="0"/>
-      </w:tblPr>
-      <w:tblGrid>
-        <w:gridCol w:w="9360"/>
-      </w:tblGrid>
-      <w:tr>
-        <w:tc>
-          <w:tcPr>
-            <w:tcW w:w="0" w:type="auto"/>
-            <w:tcBorders>
-              <w:top w:val="single" w:sz="1" w:space="0" w:color="AAAAAA"/>
-              <w:left w:val="single" w:sz="1" w:space="0" w:color="AAAAAA"/>
-              <w:bottom w:val="single" w:sz="1" w:space="0" w:color="AAAAAA"/>
-              <w:right w:val="single" w:sz="1" w:space="0" w:color="AAAAAA"/>
-            </w:tcBorders>
-            <w:shd w:val="clear" w:color="auto" w:fill="FFF2CC"/>
-            <w:tcMar>
-              <w:top w:w="80" w:type="dxa"/>
-              <w:left w:w="160" w:type="dxa"/>
-              <w:bottom w:w="80" w:type="dxa"/>
-              <w:right w:w="160" w:type="dxa"/>
-            </w:tcMar>
-          </w:tcPr>
-          <w:p>
-            <w:r>
-              <w:rPr>
-                <w:i/>
-                <w:iCs/>
-                <w:color w:val="7D6608"/>
-                <w:sz w:val="20"/>
-                <w:szCs w:val="20"/>
-              </w:rPr>
-              <w:t>💡 A seleção de atributos seguirá o método CAPTO (Zárate et al., 2023), que combina conhecimento tácito de especialistas e conhecimento explícito da literatura médica para estruturar um modelo conceitual orientador.</w:t>
-            </w:r>
-          </w:p>
-        </w:tc>
-      </w:tr>
-    </w:tbl>
     <w:p>
       <w:pPr>
         <w:spacing w:before="160" w:after="40"/>
@@ -4908,21 +4553,7 @@
               <w:rPr>
                 <w:rFonts w:ascii="Times New Roman" w:hAnsi="Times New Roman" w:cs="Times New Roman"/>
               </w:rPr>
-              <w:t xml:space="preserve">- Código P034: Nos últimos três meses, o(a) </w:t>
-            </w:r>
-            <w:proofErr w:type="spellStart"/>
-            <w:r>
-              <w:rPr>
-                <w:rFonts w:ascii="Times New Roman" w:hAnsi="Times New Roman" w:cs="Times New Roman"/>
-              </w:rPr>
-              <w:t>Sr</w:t>
-            </w:r>
-            <w:proofErr w:type="spellEnd"/>
-            <w:r>
-              <w:rPr>
-                <w:rFonts w:ascii="Times New Roman" w:hAnsi="Times New Roman" w:cs="Times New Roman"/>
-              </w:rPr>
-              <w:t>(a) praticou algum tipo de exercício físico ou esporte?</w:t>
+              <w:t>- Código P034: Nos últimos três meses, o(a) Sr(a) praticou algum tipo de exercício físico ou esporte?</w:t>
             </w:r>
           </w:p>
           <w:p>
@@ -5537,21 +5168,7 @@
               <w:rPr>
                 <w:rFonts w:ascii="Times New Roman" w:hAnsi="Times New Roman" w:cs="Times New Roman"/>
               </w:rPr>
-              <w:t xml:space="preserve">- Código P035: Quantos dias por semana o(a) </w:t>
-            </w:r>
-            <w:proofErr w:type="spellStart"/>
-            <w:r>
-              <w:rPr>
-                <w:rFonts w:ascii="Times New Roman" w:hAnsi="Times New Roman" w:cs="Times New Roman"/>
-              </w:rPr>
-              <w:t>Sr</w:t>
-            </w:r>
-            <w:proofErr w:type="spellEnd"/>
-            <w:r>
-              <w:rPr>
-                <w:rFonts w:ascii="Times New Roman" w:hAnsi="Times New Roman" w:cs="Times New Roman"/>
-              </w:rPr>
-              <w:t>(a) costuma (costumava)praticar exercício físico ou esporte?</w:t>
+              <w:t>- Código P035: Quantos dias por semana o(a) Sr(a) costuma (costumava)praticar exercício físico ou esporte?</w:t>
             </w:r>
           </w:p>
           <w:p>
@@ -6166,21 +5783,7 @@
               <w:rPr>
                 <w:rFonts w:ascii="Times New Roman" w:hAnsi="Times New Roman" w:cs="Times New Roman"/>
               </w:rPr>
-              <w:t xml:space="preserve">- Código P04501: Em média, quantas horas por dia o(a) </w:t>
-            </w:r>
-            <w:proofErr w:type="spellStart"/>
-            <w:r>
-              <w:rPr>
-                <w:rFonts w:ascii="Times New Roman" w:hAnsi="Times New Roman" w:cs="Times New Roman"/>
-              </w:rPr>
-              <w:t>Sr</w:t>
-            </w:r>
-            <w:proofErr w:type="spellEnd"/>
-            <w:r>
-              <w:rPr>
-                <w:rFonts w:ascii="Times New Roman" w:hAnsi="Times New Roman" w:cs="Times New Roman"/>
-              </w:rPr>
-              <w:t>(a) costuma ficar assistindo televisão?</w:t>
+              <w:t>- Código P04501: Em média, quantas horas por dia o(a) Sr(a) costuma ficar assistindo televisão?</w:t>
             </w:r>
           </w:p>
         </w:tc>
@@ -6794,6 +6397,7 @@
                 <w:b/>
                 <w:bCs/>
               </w:rPr>
+              <w:lastRenderedPageBreak/>
               <w:t>Dimensão: Hábitos alimentares</w:t>
             </w:r>
           </w:p>
@@ -6884,21 +6488,7 @@
               <w:rPr>
                 <w:rFonts w:ascii="Times New Roman" w:hAnsi="Times New Roman" w:cs="Times New Roman"/>
               </w:rPr>
-              <w:t xml:space="preserve">- Código P00901: Em quantos dias da semana, o(a) </w:t>
-            </w:r>
-            <w:proofErr w:type="spellStart"/>
-            <w:r>
-              <w:rPr>
-                <w:rFonts w:ascii="Times New Roman" w:hAnsi="Times New Roman" w:cs="Times New Roman"/>
-              </w:rPr>
-              <w:t>Sr</w:t>
-            </w:r>
-            <w:proofErr w:type="spellEnd"/>
-            <w:r>
-              <w:rPr>
-                <w:rFonts w:ascii="Times New Roman" w:hAnsi="Times New Roman" w:cs="Times New Roman"/>
-              </w:rPr>
-              <w:t xml:space="preserve">(a) costuma comer pelo menos um tipo de verdura ou legume (sem contar batata, mandioca, cará ou inhame) como alface, tomate, couve, cenoura, chuchu, berinjela, abobrinha? </w:t>
+              <w:t xml:space="preserve">- Código P00901: Em quantos dias da semana, o(a) Sr(a) costuma comer pelo menos um tipo de verdura ou legume (sem contar batata, mandioca, cará ou inhame) como alface, tomate, couve, cenoura, chuchu, berinjela, abobrinha? </w:t>
             </w:r>
           </w:p>
           <w:p>
@@ -7559,21 +7149,7 @@
               <w:rPr>
                 <w:rFonts w:ascii="Times New Roman" w:hAnsi="Times New Roman" w:cs="Times New Roman"/>
               </w:rPr>
-              <w:t xml:space="preserve">- Código P015: Em quantos dias da semana o(a) </w:t>
-            </w:r>
-            <w:proofErr w:type="spellStart"/>
-            <w:r>
-              <w:rPr>
-                <w:rFonts w:ascii="Times New Roman" w:hAnsi="Times New Roman" w:cs="Times New Roman"/>
-              </w:rPr>
-              <w:t>Sr</w:t>
-            </w:r>
-            <w:proofErr w:type="spellEnd"/>
-            <w:r>
-              <w:rPr>
-                <w:rFonts w:ascii="Times New Roman" w:hAnsi="Times New Roman" w:cs="Times New Roman"/>
-              </w:rPr>
-              <w:t xml:space="preserve">(a) costuma comer peixe. </w:t>
+              <w:t xml:space="preserve">- Código P015: Em quantos dias da semana o(a) Sr(a) costuma comer peixe. </w:t>
             </w:r>
           </w:p>
           <w:p>
@@ -8234,21 +7810,7 @@
               <w:rPr>
                 <w:rFonts w:ascii="Times New Roman" w:hAnsi="Times New Roman" w:cs="Times New Roman"/>
               </w:rPr>
-              <w:t xml:space="preserve">- Código P018: Em quantos dias da semana o(a) </w:t>
-            </w:r>
-            <w:proofErr w:type="spellStart"/>
-            <w:r>
-              <w:rPr>
-                <w:rFonts w:ascii="Times New Roman" w:hAnsi="Times New Roman" w:cs="Times New Roman"/>
-              </w:rPr>
-              <w:t>Sr</w:t>
-            </w:r>
-            <w:proofErr w:type="spellEnd"/>
-            <w:r>
-              <w:rPr>
-                <w:rFonts w:ascii="Times New Roman" w:hAnsi="Times New Roman" w:cs="Times New Roman"/>
-              </w:rPr>
-              <w:t>(a) costuma comer frutas.</w:t>
+              <w:t>- Código P018: Em quantos dias da semana o(a) Sr(a) costuma comer frutas.</w:t>
             </w:r>
           </w:p>
           <w:p>
@@ -8938,7 +8500,6 @@
               <w:rPr>
                 <w:rFonts w:ascii="Times New Roman" w:hAnsi="Times New Roman" w:cs="Times New Roman"/>
               </w:rPr>
-              <w:lastRenderedPageBreak/>
               <w:t>Tipo de Atributo Numérico (Discreto ou Contínuo):</w:t>
             </w:r>
             <w:r>
@@ -9041,7 +8602,6 @@
               <w:rPr>
                 <w:rFonts w:ascii="Times New Roman" w:hAnsi="Times New Roman" w:cs="Times New Roman"/>
               </w:rPr>
-              <w:lastRenderedPageBreak/>
               <w:t>- Valor Max:</w:t>
             </w:r>
             <w:r>
@@ -9566,21 +9126,7 @@
               <w:rPr>
                 <w:rFonts w:ascii="Times New Roman" w:hAnsi="Times New Roman" w:cs="Times New Roman"/>
               </w:rPr>
-              <w:t xml:space="preserve">- Código P01101: Em quantos dias da semana o(a) </w:t>
-            </w:r>
-            <w:proofErr w:type="spellStart"/>
-            <w:r>
-              <w:rPr>
-                <w:rFonts w:ascii="Times New Roman" w:hAnsi="Times New Roman" w:cs="Times New Roman"/>
-              </w:rPr>
-              <w:t>Sr</w:t>
-            </w:r>
-            <w:proofErr w:type="spellEnd"/>
-            <w:r>
-              <w:rPr>
-                <w:rFonts w:ascii="Times New Roman" w:hAnsi="Times New Roman" w:cs="Times New Roman"/>
-              </w:rPr>
-              <w:t xml:space="preserve">(a) costuma comer carne vermelha (boi, porco, cabrito, bode, ovelha etc.). </w:t>
+              <w:t xml:space="preserve">- Código P01101: Em quantos dias da semana o(a) Sr(a) costuma comer carne vermelha (boi, porco, cabrito, bode, ovelha etc.). </w:t>
             </w:r>
           </w:p>
           <w:p>
@@ -10235,21 +9781,7 @@
               <w:rPr>
                 <w:rFonts w:ascii="Times New Roman" w:hAnsi="Times New Roman" w:cs="Times New Roman"/>
               </w:rPr>
-              <w:t xml:space="preserve">- Código P02501: Em quantos dias da semana o(a) </w:t>
-            </w:r>
-            <w:proofErr w:type="spellStart"/>
-            <w:r>
-              <w:rPr>
-                <w:rFonts w:ascii="Times New Roman" w:hAnsi="Times New Roman" w:cs="Times New Roman"/>
-              </w:rPr>
-              <w:t>Sr</w:t>
-            </w:r>
-            <w:proofErr w:type="spellEnd"/>
-            <w:r>
-              <w:rPr>
-                <w:rFonts w:ascii="Times New Roman" w:hAnsi="Times New Roman" w:cs="Times New Roman"/>
-              </w:rPr>
-              <w:t xml:space="preserve">(a) costuma comer alimentos doces como biscoito/bolacha recheado, chocolate, gelatina, balas e outros. </w:t>
+              <w:t xml:space="preserve">- Código P02501: Em quantos dias da semana o(a) Sr(a) costuma comer alimentos doces como biscoito/bolacha recheado, chocolate, gelatina, balas e outros. </w:t>
             </w:r>
           </w:p>
           <w:p>
@@ -10929,21 +10461,7 @@
               <w:rPr>
                 <w:rFonts w:ascii="Times New Roman" w:hAnsi="Times New Roman" w:cs="Times New Roman"/>
               </w:rPr>
-              <w:t xml:space="preserve">- Código P02602: Em quantos dias da semana o(a) </w:t>
-            </w:r>
-            <w:proofErr w:type="spellStart"/>
-            <w:r>
-              <w:rPr>
-                <w:rFonts w:ascii="Times New Roman" w:hAnsi="Times New Roman" w:cs="Times New Roman"/>
-              </w:rPr>
-              <w:t>Sr</w:t>
-            </w:r>
-            <w:proofErr w:type="spellEnd"/>
-            <w:r>
-              <w:rPr>
-                <w:rFonts w:ascii="Times New Roman" w:hAnsi="Times New Roman" w:cs="Times New Roman"/>
-              </w:rPr>
-              <w:t xml:space="preserve">(a) costuma substituir a refeição do almoço por lanches rápidos como sanduíches, salgados, pizza, cachorro-quente etc. </w:t>
+              <w:t xml:space="preserve">- Código P02602: Em quantos dias da semana o(a) Sr(a) costuma substituir a refeição do almoço por lanches rápidos como sanduíches, salgados, pizza, cachorro-quente etc. </w:t>
             </w:r>
           </w:p>
           <w:p>
@@ -11636,7 +11154,6 @@
               <w:rPr>
                 <w:rFonts w:ascii="Times New Roman" w:hAnsi="Times New Roman" w:cs="Times New Roman"/>
               </w:rPr>
-              <w:lastRenderedPageBreak/>
               <w:t>Tipo de Atributo Numérico (Discreto ou Contínuo):</w:t>
             </w:r>
             <w:r>
@@ -11733,7 +11250,6 @@
               <w:rPr>
                 <w:rFonts w:ascii="Times New Roman" w:hAnsi="Times New Roman" w:cs="Times New Roman"/>
               </w:rPr>
-              <w:lastRenderedPageBreak/>
               <w:t>- Valor Max:</w:t>
             </w:r>
             <w:r>
@@ -12240,21 +11756,7 @@
               <w:rPr>
                 <w:rFonts w:ascii="Times New Roman" w:hAnsi="Times New Roman" w:cs="Times New Roman"/>
               </w:rPr>
-              <w:t xml:space="preserve">- Código P02601: Considerando a comida preparada na hora e os alimentos industrializados, o(a) </w:t>
-            </w:r>
-            <w:proofErr w:type="spellStart"/>
-            <w:r>
-              <w:rPr>
-                <w:rFonts w:ascii="Times New Roman" w:hAnsi="Times New Roman" w:cs="Times New Roman"/>
-              </w:rPr>
-              <w:t>Sr</w:t>
-            </w:r>
-            <w:proofErr w:type="spellEnd"/>
-            <w:r>
-              <w:rPr>
-                <w:rFonts w:ascii="Times New Roman" w:hAnsi="Times New Roman" w:cs="Times New Roman"/>
-              </w:rPr>
-              <w:t>(a) acha que o seu consumo de sal é muito alto, alto, adequado, baixo ou muito baixo.</w:t>
+              <w:t>- Código P02601: Considerando a comida preparada na hora e os alimentos industrializados, o(a) Sr(a) acha que o seu consumo de sal é muito alto, alto, adequado, baixo ou muito baixo.</w:t>
             </w:r>
           </w:p>
           <w:p>
@@ -14340,6 +13842,7 @@
               <w:rPr>
                 <w:rFonts w:ascii="Times New Roman" w:hAnsi="Times New Roman" w:cs="Times New Roman"/>
               </w:rPr>
+              <w:lastRenderedPageBreak/>
               <w:t xml:space="preserve">- </w:t>
             </w:r>
             <w:r>
@@ -14368,6 +13871,7 @@
               <w:rPr>
                 <w:rFonts w:ascii="Times New Roman" w:hAnsi="Times New Roman" w:cs="Times New Roman"/>
               </w:rPr>
+              <w:lastRenderedPageBreak/>
               <w:t>Tipo de Atributo Numérico (Discreto ou Contínuo):</w:t>
             </w:r>
             <w:r>
@@ -16957,6 +16461,7 @@
               <w:rPr>
                 <w:rFonts w:ascii="Times New Roman" w:hAnsi="Times New Roman" w:cs="Times New Roman"/>
               </w:rPr>
+              <w:lastRenderedPageBreak/>
               <w:t>Tipo de Atributo Numérico (Discreto ou Contínuo):</w:t>
             </w:r>
             <w:r>
@@ -22164,6 +21669,7 @@
               <w:rPr>
                 <w:rFonts w:ascii="Times New Roman" w:hAnsi="Times New Roman" w:cs="Times New Roman"/>
               </w:rPr>
+              <w:lastRenderedPageBreak/>
               <w:t>Tipo de Atributo Numérico (Discreto ou Contínuo):</w:t>
             </w:r>
             <w:r>
@@ -24917,6 +24423,7 @@
               <w:rPr>
                 <w:rFonts w:ascii="Times New Roman" w:hAnsi="Times New Roman" w:cs="Times New Roman"/>
               </w:rPr>
+              <w:lastRenderedPageBreak/>
               <w:t>Tipo de Atributo Numérico (Discreto ou Contínuo):</w:t>
             </w:r>
             <w:r>
@@ -29497,14 +29004,7 @@
               <w:rPr>
                 <w:rFonts w:ascii="Times New Roman" w:hAnsi="Times New Roman" w:cs="Times New Roman"/>
               </w:rPr>
-              <w:t xml:space="preserve">- Código G080:  ___ tem dificuldade permanente para pegar objetos pequenos, como botões e lápis, ou abrir e fechar recipientes ou garrafas, mesmo usando prótese ou aparelho de auxílio? </w:t>
-            </w:r>
-            <w:r>
-              <w:rPr>
-                <w:rFonts w:ascii="Times New Roman" w:hAnsi="Times New Roman" w:cs="Times New Roman"/>
-              </w:rPr>
-              <w:lastRenderedPageBreak/>
-              <w:t>(Somente para moradores com 5 anos ou mais de idade.)</w:t>
+              <w:t>- Código G080:  ___ tem dificuldade permanente para pegar objetos pequenos, como botões e lápis, ou abrir e fechar recipientes ou garrafas, mesmo usando prótese ou aparelho de auxílio? (Somente para moradores com 5 anos ou mais de idade.)</w:t>
             </w:r>
           </w:p>
           <w:p>
@@ -29535,7 +29035,6 @@
               <w:rPr>
                 <w:rFonts w:ascii="Times New Roman" w:hAnsi="Times New Roman" w:cs="Times New Roman"/>
               </w:rPr>
-              <w:lastRenderedPageBreak/>
               <w:t>Tipo de Atributo Numérico (Discreto ou Contínuo):</w:t>
             </w:r>
             <w:r>
@@ -32174,28 +31673,7 @@
               <w:rPr>
                 <w:rFonts w:ascii="Times New Roman" w:hAnsi="Times New Roman" w:cs="Times New Roman"/>
               </w:rPr>
-              <w:t xml:space="preserve">- Código N010: Nas duas últimas semanas, com que frequência o(a) </w:t>
-            </w:r>
-            <w:proofErr w:type="spellStart"/>
-            <w:r>
-              <w:rPr>
-                <w:rFonts w:ascii="Times New Roman" w:hAnsi="Times New Roman" w:cs="Times New Roman"/>
-              </w:rPr>
-              <w:t>Sr</w:t>
-            </w:r>
-            <w:proofErr w:type="spellEnd"/>
-            <w:r>
-              <w:rPr>
-                <w:rFonts w:ascii="Times New Roman" w:hAnsi="Times New Roman" w:cs="Times New Roman"/>
-              </w:rPr>
-              <w:t xml:space="preserve">(a) teve problemas no sono, como dificuldade para adormecer, acordar </w:t>
-            </w:r>
-            <w:r>
-              <w:rPr>
-                <w:rFonts w:ascii="Times New Roman" w:hAnsi="Times New Roman" w:cs="Times New Roman"/>
-              </w:rPr>
-              <w:lastRenderedPageBreak/>
-              <w:t>frequentemente à noite ou dormir mais do que de costume?</w:t>
+              <w:t>- Código N010: Nas duas últimas semanas, com que frequência o(a) Sr(a) teve problemas no sono, como dificuldade para adormecer, acordar frequentemente à noite ou dormir mais do que de costume?</w:t>
             </w:r>
           </w:p>
         </w:tc>
@@ -32217,7 +31695,6 @@
               <w:rPr>
                 <w:rFonts w:ascii="Times New Roman" w:hAnsi="Times New Roman" w:cs="Times New Roman"/>
               </w:rPr>
-              <w:lastRenderedPageBreak/>
               <w:t>Tipo de Atributo Numérico (Discreto ou Contínuo):</w:t>
             </w:r>
             <w:r>
@@ -32838,21 +32315,7 @@
               <w:rPr>
                 <w:rFonts w:ascii="Times New Roman" w:hAnsi="Times New Roman" w:cs="Times New Roman"/>
               </w:rPr>
-              <w:t xml:space="preserve">- Código N011: Nas duas últimas semanas, com que frequência o(a) </w:t>
-            </w:r>
-            <w:proofErr w:type="spellStart"/>
-            <w:r>
-              <w:rPr>
-                <w:rFonts w:ascii="Times New Roman" w:hAnsi="Times New Roman" w:cs="Times New Roman"/>
-              </w:rPr>
-              <w:t>Sr</w:t>
-            </w:r>
-            <w:proofErr w:type="spellEnd"/>
-            <w:r>
-              <w:rPr>
-                <w:rFonts w:ascii="Times New Roman" w:hAnsi="Times New Roman" w:cs="Times New Roman"/>
-              </w:rPr>
-              <w:t>(a) teve problemas por não se sentir descansado(a) e disposto(a) durante o dia, sentindo-se cansado(a), sem ter energia?</w:t>
+              <w:t>- Código N011: Nas duas últimas semanas, com que frequência o(a) Sr(a) teve problemas por não se sentir descansado(a) e disposto(a) durante o dia, sentindo-se cansado(a), sem ter energia?</w:t>
             </w:r>
           </w:p>
           <w:p>
@@ -33524,21 +32987,7 @@
               <w:rPr>
                 <w:rFonts w:ascii="Times New Roman" w:hAnsi="Times New Roman" w:cs="Times New Roman"/>
               </w:rPr>
-              <w:t xml:space="preserve">- Código Q11006: Algum médico ou profissional de saúde (como psiquiatra ou psicólogo) já lhe deu o diagnóstico de outra doença mental, como transtorno de ansiedade, síndrome do pânico, esquizofrenia, transtorno bipolar, psicose ou TOC (Transtorno Obsessivo Compulsivo) </w:t>
-            </w:r>
-            <w:proofErr w:type="spellStart"/>
-            <w:r>
-              <w:rPr>
-                <w:rFonts w:ascii="Times New Roman" w:hAnsi="Times New Roman" w:cs="Times New Roman"/>
-              </w:rPr>
-              <w:t>etc</w:t>
-            </w:r>
-            <w:proofErr w:type="spellEnd"/>
-            <w:r>
-              <w:rPr>
-                <w:rFonts w:ascii="Times New Roman" w:hAnsi="Times New Roman" w:cs="Times New Roman"/>
-              </w:rPr>
-              <w:t>?</w:t>
+              <w:t>- Código Q11006: Algum médico ou profissional de saúde (como psiquiatra ou psicólogo) já lhe deu o diagnóstico de outra doença mental, como transtorno de ansiedade, síndrome do pânico, esquizofrenia, transtorno bipolar, psicose ou TOC (Transtorno Obsessivo Compulsivo) etc?</w:t>
             </w:r>
           </w:p>
           <w:p>
@@ -34836,14 +34285,7 @@
               <w:rPr>
                 <w:rFonts w:ascii="Times New Roman" w:hAnsi="Times New Roman" w:cs="Times New Roman"/>
               </w:rPr>
-              <w:t xml:space="preserve">- Código Q109: Em geral, em que grau a depressão limita as suas atividades </w:t>
-            </w:r>
-            <w:r>
-              <w:rPr>
-                <w:rFonts w:ascii="Times New Roman" w:hAnsi="Times New Roman" w:cs="Times New Roman"/>
-              </w:rPr>
-              <w:lastRenderedPageBreak/>
-              <w:t>habituais (tais como trabalhar, realizar afazeres domésticos etc.)?</w:t>
+              <w:t>- Código Q109: Em geral, em que grau a depressão limita as suas atividades habituais (tais como trabalhar, realizar afazeres domésticos etc.)?</w:t>
             </w:r>
           </w:p>
         </w:tc>
@@ -34866,7 +34308,6 @@
               <w:rPr>
                 <w:rFonts w:ascii="Times New Roman" w:hAnsi="Times New Roman" w:cs="Times New Roman"/>
               </w:rPr>
-              <w:lastRenderedPageBreak/>
               <w:t>Tipo de Atributo Numérico (Discreto ou Contínuo):</w:t>
             </w:r>
             <w:r>
@@ -35529,21 +34970,7 @@
               <w:rPr>
                 <w:rFonts w:ascii="Times New Roman" w:hAnsi="Times New Roman" w:cs="Times New Roman"/>
               </w:rPr>
-              <w:t xml:space="preserve">- Código N001: Em geral, como o(a) </w:t>
-            </w:r>
-            <w:proofErr w:type="spellStart"/>
-            <w:r>
-              <w:rPr>
-                <w:rFonts w:ascii="Times New Roman" w:hAnsi="Times New Roman" w:cs="Times New Roman"/>
-              </w:rPr>
-              <w:t>Sr</w:t>
-            </w:r>
-            <w:proofErr w:type="spellEnd"/>
-            <w:r>
-              <w:rPr>
-                <w:rFonts w:ascii="Times New Roman" w:hAnsi="Times New Roman" w:cs="Times New Roman"/>
-              </w:rPr>
-              <w:t xml:space="preserve">(a) avalia a sua saúde? </w:t>
+              <w:t xml:space="preserve">- Código N001: Em geral, como o(a) Sr(a) avalia a sua saúde? </w:t>
             </w:r>
           </w:p>
         </w:tc>
@@ -39446,21 +38873,7 @@
               <w:rPr>
                 <w:rFonts w:ascii="Times New Roman" w:hAnsi="Times New Roman" w:cs="Times New Roman"/>
               </w:rPr>
-              <w:t xml:space="preserve">- Código Q084: O(a) </w:t>
-            </w:r>
-            <w:proofErr w:type="spellStart"/>
-            <w:r>
-              <w:rPr>
-                <w:rFonts w:ascii="Times New Roman" w:hAnsi="Times New Roman" w:cs="Times New Roman"/>
-              </w:rPr>
-              <w:t>Sr</w:t>
-            </w:r>
-            <w:proofErr w:type="spellEnd"/>
-            <w:r>
-              <w:rPr>
-                <w:rFonts w:ascii="Times New Roman" w:hAnsi="Times New Roman" w:cs="Times New Roman"/>
-              </w:rPr>
-              <w:t xml:space="preserve">(a) tem algum problema crônico de coluna, como dor crônica nas costas ou no pescoço, lombalgia, dor ciática, problemas nas vértebras ou disco? </w:t>
+              <w:t xml:space="preserve">- Código Q084: O(a) Sr(a) tem algum problema crônico de coluna, como dor crônica nas costas ou no pescoço, lombalgia, dor ciática, problemas nas vértebras ou disco? </w:t>
             </w:r>
           </w:p>
           <w:p>
@@ -42708,7 +42121,6 @@
                 <w:b/>
                 <w:bCs/>
               </w:rPr>
-              <w:lastRenderedPageBreak/>
               <w:t>Dados laboratoriais</w:t>
             </w:r>
           </w:p>
@@ -44054,21 +43466,7 @@
               <w:rPr>
                 <w:rFonts w:ascii="Times New Roman" w:hAnsi="Times New Roman" w:cs="Times New Roman"/>
               </w:rPr>
-              <w:t xml:space="preserve">- Código Q05901: Quando foi a última vez que o(a) </w:t>
-            </w:r>
-            <w:proofErr w:type="spellStart"/>
-            <w:r>
-              <w:rPr>
-                <w:rFonts w:ascii="Times New Roman" w:hAnsi="Times New Roman" w:cs="Times New Roman"/>
-              </w:rPr>
-              <w:t>Sr</w:t>
-            </w:r>
-            <w:proofErr w:type="spellEnd"/>
-            <w:r>
-              <w:rPr>
-                <w:rFonts w:ascii="Times New Roman" w:hAnsi="Times New Roman" w:cs="Times New Roman"/>
-              </w:rPr>
-              <w:t>(a) fez exame de sangue para medir o colesterol e triglicerídeos?</w:t>
+              <w:t>- Código Q05901: Quando foi a última vez que o(a) Sr(a) fez exame de sangue para medir o colesterol e triglicerídeos?</w:t>
             </w:r>
           </w:p>
           <w:p>
@@ -48171,7 +47569,6 @@
                 <w:b/>
                 <w:bCs/>
               </w:rPr>
-              <w:lastRenderedPageBreak/>
               <w:t>Escolaridade</w:t>
             </w:r>
           </w:p>
@@ -50464,23 +49861,7 @@
                 <w:sz w:val="20"/>
                 <w:szCs w:val="20"/>
               </w:rPr>
-              <w:t xml:space="preserve"> até 3 </w:t>
-            </w:r>
-            <w:proofErr w:type="spellStart"/>
-            <w:r>
-              <w:rPr>
-                <w:sz w:val="20"/>
-                <w:szCs w:val="20"/>
-              </w:rPr>
-              <w:t>desvíos</w:t>
-            </w:r>
-            <w:proofErr w:type="spellEnd"/>
-            <w:r>
-              <w:rPr>
-                <w:sz w:val="20"/>
-                <w:szCs w:val="20"/>
-              </w:rPr>
-              <w:t xml:space="preserve"> padrões</w:t>
+              <w:t xml:space="preserve"> até 3 desvíos padrões</w:t>
             </w:r>
             <w:r>
               <w:rPr>
@@ -50518,7 +49899,6 @@
                 <w:sz w:val="20"/>
                 <w:szCs w:val="20"/>
               </w:rPr>
-              <w:lastRenderedPageBreak/>
               <w:t>Balanceamento</w:t>
             </w:r>
           </w:p>
@@ -50546,55 +49926,7 @@
                 <w:sz w:val="20"/>
                 <w:szCs w:val="20"/>
               </w:rPr>
-              <w:t xml:space="preserve">Random </w:t>
-            </w:r>
-            <w:proofErr w:type="spellStart"/>
-            <w:r>
-              <w:rPr>
-                <w:sz w:val="20"/>
-                <w:szCs w:val="20"/>
-              </w:rPr>
-              <w:t>Under</w:t>
-            </w:r>
-            <w:proofErr w:type="spellEnd"/>
-            <w:r>
-              <w:rPr>
-                <w:sz w:val="20"/>
-                <w:szCs w:val="20"/>
-              </w:rPr>
-              <w:t xml:space="preserve"> </w:t>
-            </w:r>
-            <w:proofErr w:type="spellStart"/>
-            <w:r>
-              <w:rPr>
-                <w:sz w:val="20"/>
-                <w:szCs w:val="20"/>
-              </w:rPr>
-              <w:t>Sampler</w:t>
-            </w:r>
-            <w:proofErr w:type="spellEnd"/>
-            <w:r>
-              <w:rPr>
-                <w:sz w:val="20"/>
-                <w:szCs w:val="20"/>
-              </w:rPr>
-              <w:t xml:space="preserve"> (RUS) — mesma abordagem de Melo et al. (2024), Silva &amp; Zárate (2024) e </w:t>
-            </w:r>
-            <w:proofErr w:type="spellStart"/>
-            <w:r>
-              <w:rPr>
-                <w:sz w:val="20"/>
-                <w:szCs w:val="20"/>
-              </w:rPr>
-              <w:t>Cancella</w:t>
-            </w:r>
-            <w:proofErr w:type="spellEnd"/>
-            <w:r>
-              <w:rPr>
-                <w:sz w:val="20"/>
-                <w:szCs w:val="20"/>
-              </w:rPr>
-              <w:t xml:space="preserve"> &amp; Zárate (2025).</w:t>
+              <w:t>Random Under Sampler (RUS) — mesma abordagem de Melo et al. (2024), Silva &amp; Zárate (2024) e Cancella &amp; Zárate (2025).</w:t>
             </w:r>
           </w:p>
         </w:tc>
@@ -50652,71 +49984,7 @@
                 <w:sz w:val="20"/>
                 <w:szCs w:val="20"/>
               </w:rPr>
-              <w:t xml:space="preserve">Árvore de Decisão (Decision </w:t>
-            </w:r>
-            <w:proofErr w:type="spellStart"/>
-            <w:r>
-              <w:rPr>
-                <w:sz w:val="20"/>
-                <w:szCs w:val="20"/>
-              </w:rPr>
-              <w:t>Tree</w:t>
-            </w:r>
-            <w:proofErr w:type="spellEnd"/>
-            <w:r>
-              <w:rPr>
-                <w:sz w:val="20"/>
-                <w:szCs w:val="20"/>
-              </w:rPr>
-              <w:t>), Classificador Bayesiano (</w:t>
-            </w:r>
-            <w:proofErr w:type="spellStart"/>
-            <w:r>
-              <w:rPr>
-                <w:sz w:val="20"/>
-                <w:szCs w:val="20"/>
-              </w:rPr>
-              <w:t>Naive</w:t>
-            </w:r>
-            <w:proofErr w:type="spellEnd"/>
-            <w:r>
-              <w:rPr>
-                <w:sz w:val="20"/>
-                <w:szCs w:val="20"/>
-              </w:rPr>
-              <w:t xml:space="preserve"> </w:t>
-            </w:r>
-            <w:proofErr w:type="spellStart"/>
-            <w:r>
-              <w:rPr>
-                <w:sz w:val="20"/>
-                <w:szCs w:val="20"/>
-              </w:rPr>
-              <w:t>Bayes</w:t>
-            </w:r>
-            <w:proofErr w:type="spellEnd"/>
-            <w:r>
-              <w:rPr>
-                <w:sz w:val="20"/>
-                <w:szCs w:val="20"/>
-              </w:rPr>
-              <w:t xml:space="preserve">) — maior </w:t>
-            </w:r>
-            <w:proofErr w:type="spellStart"/>
-            <w:r>
-              <w:rPr>
-                <w:sz w:val="20"/>
-                <w:szCs w:val="20"/>
-              </w:rPr>
-              <w:t>interpretabilidade</w:t>
-            </w:r>
-            <w:proofErr w:type="spellEnd"/>
-            <w:r>
-              <w:rPr>
-                <w:sz w:val="20"/>
-                <w:szCs w:val="20"/>
-              </w:rPr>
-              <w:t>.</w:t>
+              <w:t>Árvore de Decisão (Decision Tree), Classificador Bayesiano (Naive Bayes) — maior interpretabilidade.</w:t>
             </w:r>
           </w:p>
         </w:tc>
@@ -50774,23 +50042,7 @@
                 <w:sz w:val="20"/>
                 <w:szCs w:val="20"/>
               </w:rPr>
-              <w:t xml:space="preserve">Floresta Aleatória (Random Forest), </w:t>
-            </w:r>
-            <w:proofErr w:type="spellStart"/>
-            <w:r>
-              <w:rPr>
-                <w:sz w:val="20"/>
-                <w:szCs w:val="20"/>
-              </w:rPr>
-              <w:t>AdaBoost</w:t>
-            </w:r>
-            <w:proofErr w:type="spellEnd"/>
-            <w:r>
-              <w:rPr>
-                <w:sz w:val="20"/>
-                <w:szCs w:val="20"/>
-              </w:rPr>
-              <w:t xml:space="preserve"> — melhor desempenho preditivo.</w:t>
+              <w:t>Floresta Aleatória (Random Forest), AdaBoost — melhor desempenho preditivo.</w:t>
             </w:r>
           </w:p>
         </w:tc>
@@ -50821,19 +50073,8 @@
                 <w:sz w:val="20"/>
                 <w:szCs w:val="20"/>
               </w:rPr>
-              <w:t xml:space="preserve">Otimização de </w:t>
-            </w:r>
-            <w:proofErr w:type="spellStart"/>
-            <w:r>
-              <w:rPr>
-                <w:b/>
-                <w:bCs/>
-                <w:sz w:val="20"/>
-                <w:szCs w:val="20"/>
-              </w:rPr>
-              <w:t>hiperparâmetros</w:t>
-            </w:r>
-            <w:proofErr w:type="spellEnd"/>
+              <w:t>Otimização de hiperparâmetros</w:t>
+            </w:r>
           </w:p>
         </w:tc>
         <w:tc>
@@ -50854,37 +50095,12 @@
             </w:tcMar>
           </w:tcPr>
           <w:p>
-            <w:proofErr w:type="spellStart"/>
             <w:r>
               <w:rPr>
                 <w:sz w:val="20"/>
                 <w:szCs w:val="20"/>
               </w:rPr>
-              <w:t>RandomizedSearchCV</w:t>
-            </w:r>
-            <w:proofErr w:type="spellEnd"/>
-            <w:r>
-              <w:rPr>
-                <w:sz w:val="20"/>
-                <w:szCs w:val="20"/>
-              </w:rPr>
-              <w:t xml:space="preserve"> (</w:t>
-            </w:r>
-            <w:proofErr w:type="spellStart"/>
-            <w:r>
-              <w:rPr>
-                <w:sz w:val="20"/>
-                <w:szCs w:val="20"/>
-              </w:rPr>
-              <w:t>scikit-learn</w:t>
-            </w:r>
-            <w:proofErr w:type="spellEnd"/>
-            <w:r>
-              <w:rPr>
-                <w:sz w:val="20"/>
-                <w:szCs w:val="20"/>
-              </w:rPr>
-              <w:t>, Python).</w:t>
+              <w:t>RandomizedSearchCV (scikit-learn, Python).</w:t>
             </w:r>
           </w:p>
         </w:tc>
@@ -50937,21 +50153,12 @@
             </w:tcMar>
           </w:tcPr>
           <w:p>
-            <w:proofErr w:type="spellStart"/>
             <w:r>
               <w:rPr>
                 <w:sz w:val="20"/>
                 <w:szCs w:val="20"/>
               </w:rPr>
-              <w:t>Holdout</w:t>
-            </w:r>
-            <w:proofErr w:type="spellEnd"/>
-            <w:r>
-              <w:rPr>
-                <w:sz w:val="20"/>
-                <w:szCs w:val="20"/>
-              </w:rPr>
-              <w:t xml:space="preserve"> 80/20 (treino/teste) + Validação cruzada 10-fold com IC 95% para F1-Measure.</w:t>
+              <w:t>Holdout 80/20 (treino/teste) + Validação cruzada 10-fold com IC 95% para F1-Measure.</w:t>
             </w:r>
           </w:p>
         </w:tc>
@@ -50982,6 +50189,7 @@
                 <w:sz w:val="20"/>
                 <w:szCs w:val="20"/>
               </w:rPr>
+              <w:lastRenderedPageBreak/>
               <w:t>Métricas principais</w:t>
             </w:r>
           </w:p>
@@ -51009,23 +50217,7 @@
                 <w:sz w:val="20"/>
                 <w:szCs w:val="20"/>
               </w:rPr>
-              <w:t xml:space="preserve">Precisão, Recall (Sensibilidade), F1-score por classe, AUC-ROC, </w:t>
-            </w:r>
-            <w:proofErr w:type="spellStart"/>
-            <w:r>
-              <w:rPr>
-                <w:sz w:val="20"/>
-                <w:szCs w:val="20"/>
-              </w:rPr>
-              <w:t>teste-T</w:t>
-            </w:r>
-            <w:proofErr w:type="spellEnd"/>
-            <w:r>
-              <w:rPr>
-                <w:sz w:val="20"/>
-                <w:szCs w:val="20"/>
-              </w:rPr>
-              <w:t xml:space="preserve"> para comparação dos modelos.</w:t>
+              <w:t>Precisão, Recall (Sensibilidade), F1-score por classe, AUC-ROC, teste-T para comparação dos modelos.</w:t>
             </w:r>
           </w:p>
         </w:tc>
@@ -51083,55 +50275,7 @@
                 <w:sz w:val="20"/>
                 <w:szCs w:val="20"/>
               </w:rPr>
-              <w:t xml:space="preserve">Feature </w:t>
-            </w:r>
-            <w:proofErr w:type="spellStart"/>
-            <w:r>
-              <w:rPr>
-                <w:sz w:val="20"/>
-                <w:szCs w:val="20"/>
-              </w:rPr>
-              <w:t>Importance</w:t>
-            </w:r>
-            <w:proofErr w:type="spellEnd"/>
-            <w:r>
-              <w:rPr>
-                <w:sz w:val="20"/>
-                <w:szCs w:val="20"/>
-              </w:rPr>
-              <w:t xml:space="preserve"> via </w:t>
-            </w:r>
-            <w:proofErr w:type="spellStart"/>
-            <w:r>
-              <w:rPr>
-                <w:sz w:val="20"/>
-                <w:szCs w:val="20"/>
-              </w:rPr>
-              <w:t>scikit-learn</w:t>
-            </w:r>
-            <w:proofErr w:type="spellEnd"/>
-            <w:r>
-              <w:rPr>
-                <w:sz w:val="20"/>
-                <w:szCs w:val="20"/>
-              </w:rPr>
-              <w:t xml:space="preserve"> (ganho de informação) para Árvore de Decisão, Floresta Aleatória e </w:t>
-            </w:r>
-            <w:proofErr w:type="spellStart"/>
-            <w:r>
-              <w:rPr>
-                <w:sz w:val="20"/>
-                <w:szCs w:val="20"/>
-              </w:rPr>
-              <w:t>AdaBoost</w:t>
-            </w:r>
-            <w:proofErr w:type="spellEnd"/>
-            <w:r>
-              <w:rPr>
-                <w:sz w:val="20"/>
-                <w:szCs w:val="20"/>
-              </w:rPr>
-              <w:t>.</w:t>
+              <w:t>Feature Importance via scikit-learn (ganho de informação) para Árvore de Decisão, Floresta Aleatória e AdaBoost.</w:t>
             </w:r>
           </w:p>
         </w:tc>
@@ -51189,71 +50333,7 @@
                 <w:sz w:val="20"/>
                 <w:szCs w:val="20"/>
               </w:rPr>
-              <w:t>Python (</w:t>
-            </w:r>
-            <w:proofErr w:type="spellStart"/>
-            <w:r>
-              <w:rPr>
-                <w:sz w:val="20"/>
-                <w:szCs w:val="20"/>
-              </w:rPr>
-              <w:t>scikit-learn</w:t>
-            </w:r>
-            <w:proofErr w:type="spellEnd"/>
-            <w:r>
-              <w:rPr>
-                <w:sz w:val="20"/>
-                <w:szCs w:val="20"/>
-              </w:rPr>
-              <w:t xml:space="preserve">, pandas, </w:t>
-            </w:r>
-            <w:proofErr w:type="spellStart"/>
-            <w:r>
-              <w:rPr>
-                <w:sz w:val="20"/>
-                <w:szCs w:val="20"/>
-              </w:rPr>
-              <w:t>numpy</w:t>
-            </w:r>
-            <w:proofErr w:type="spellEnd"/>
-            <w:r>
-              <w:rPr>
-                <w:sz w:val="20"/>
-                <w:szCs w:val="20"/>
-              </w:rPr>
-              <w:t xml:space="preserve">, </w:t>
-            </w:r>
-            <w:proofErr w:type="spellStart"/>
-            <w:r>
-              <w:rPr>
-                <w:sz w:val="20"/>
-                <w:szCs w:val="20"/>
-              </w:rPr>
-              <w:t>matplotlib</w:t>
-            </w:r>
-            <w:proofErr w:type="spellEnd"/>
-            <w:r>
-              <w:rPr>
-                <w:sz w:val="20"/>
-                <w:szCs w:val="20"/>
-              </w:rPr>
-              <w:t xml:space="preserve">) e/ou KNIME </w:t>
-            </w:r>
-            <w:proofErr w:type="spellStart"/>
-            <w:r>
-              <w:rPr>
-                <w:sz w:val="20"/>
-                <w:szCs w:val="20"/>
-              </w:rPr>
-              <w:t>Analytics</w:t>
-            </w:r>
-            <w:proofErr w:type="spellEnd"/>
-            <w:r>
-              <w:rPr>
-                <w:sz w:val="20"/>
-                <w:szCs w:val="20"/>
-              </w:rPr>
-              <w:t xml:space="preserve"> Platform.</w:t>
+              <w:t>Python (scikit-learn, pandas, numpy, matplotlib) e/ou KNIME Analytics Platform.</w:t>
             </w:r>
           </w:p>
         </w:tc>
@@ -51281,64 +50361,6 @@
         <w:t>📈  FASE 3 — SEÇÃO DE RESULTADOS</w:t>
       </w:r>
     </w:p>
-    <w:p>
-      <w:pPr>
-        <w:spacing w:before="60" w:after="60"/>
-      </w:pPr>
-    </w:p>
-    <w:tbl>
-      <w:tblPr>
-        <w:tblW w:w="9360" w:type="dxa"/>
-        <w:tblBorders>
-          <w:top w:val="single" w:sz="4" w:space="0" w:color="auto"/>
-          <w:left w:val="single" w:sz="4" w:space="0" w:color="auto"/>
-          <w:bottom w:val="single" w:sz="4" w:space="0" w:color="auto"/>
-          <w:right w:val="single" w:sz="4" w:space="0" w:color="auto"/>
-          <w:insideH w:val="single" w:sz="4" w:space="0" w:color="auto"/>
-          <w:insideV w:val="single" w:sz="4" w:space="0" w:color="auto"/>
-        </w:tblBorders>
-        <w:tblCellMar>
-          <w:left w:w="10" w:type="dxa"/>
-          <w:right w:w="10" w:type="dxa"/>
-        </w:tblCellMar>
-        <w:tblLook w:val="0000" w:firstRow="0" w:lastRow="0" w:firstColumn="0" w:lastColumn="0" w:noHBand="0" w:noVBand="0"/>
-      </w:tblPr>
-      <w:tblGrid>
-        <w:gridCol w:w="9360"/>
-      </w:tblGrid>
-      <w:tr>
-        <w:tc>
-          <w:tcPr>
-            <w:tcW w:w="0" w:type="auto"/>
-            <w:tcBorders>
-              <w:top w:val="single" w:sz="1" w:space="0" w:color="AAAAAA"/>
-              <w:left w:val="single" w:sz="1" w:space="0" w:color="AAAAAA"/>
-              <w:bottom w:val="single" w:sz="1" w:space="0" w:color="AAAAAA"/>
-              <w:right w:val="single" w:sz="1" w:space="0" w:color="AAAAAA"/>
-            </w:tcBorders>
-            <w:shd w:val="clear" w:color="auto" w:fill="FFF2CC"/>
-            <w:tcMar>
-              <w:top w:w="80" w:type="dxa"/>
-              <w:left w:w="160" w:type="dxa"/>
-              <w:bottom w:w="80" w:type="dxa"/>
-              <w:right w:w="160" w:type="dxa"/>
-            </w:tcMar>
-          </w:tcPr>
-          <w:p>
-            <w:r>
-              <w:rPr>
-                <w:i/>
-                <w:iCs/>
-                <w:color w:val="7D6608"/>
-                <w:sz w:val="20"/>
-                <w:szCs w:val="20"/>
-              </w:rPr>
-              <w:t>💡 Os resultados devem ser apresentados sem interpretações. Apresente tabelas e gráficos de métricas dos modelos e de importância de atributos, seguindo o padrão dos artigos de referência.</w:t>
-            </w:r>
-          </w:p>
-        </w:tc>
-      </w:tr>
-    </w:tbl>
     <w:p>
       <w:pPr>
         <w:spacing w:before="80" w:after="80"/>
@@ -51406,12 +50428,65 @@
             </w:tcMar>
           </w:tcPr>
           <w:p>
+            <w:pPr>
+              <w:pStyle w:val="PargrafodaLista"/>
+              <w:numPr>
+                <w:ilvl w:val="0"/>
+                <w:numId w:val="8"/>
+              </w:numPr>
+            </w:pPr>
             <w:r>
               <w:rPr>
                 <w:sz w:val="20"/>
                 <w:szCs w:val="20"/>
               </w:rPr>
-              <w:t>Descrever o tamanho amostral final após os critérios de inclusão/exclusão e o balanceamento. Apresentar distribuição das classes (Saudável vs. Artrite) antes e após o RUS. Comparar características sociodemográficas e nutricionais entre os grupos (Tabela 1 — a ser construída após análise exploratória dos dados).</w:t>
+              <w:t xml:space="preserve">Descrever o tamanho amostral final após os critérios de inclusão/exclusão e o balanceamento. </w:t>
+            </w:r>
+            <w:r>
+              <w:rPr>
+                <w:sz w:val="20"/>
+                <w:szCs w:val="20"/>
+              </w:rPr>
+              <w:br/>
+            </w:r>
+          </w:p>
+          <w:p>
+            <w:pPr>
+              <w:pStyle w:val="PargrafodaLista"/>
+              <w:numPr>
+                <w:ilvl w:val="0"/>
+                <w:numId w:val="8"/>
+              </w:numPr>
+            </w:pPr>
+            <w:r>
+              <w:rPr>
+                <w:sz w:val="20"/>
+                <w:szCs w:val="20"/>
+              </w:rPr>
+              <w:t xml:space="preserve">Apresentar distribuição das classes (Saudável vs. Artrite) antes e após o RUS. </w:t>
+            </w:r>
+            <w:r>
+              <w:rPr>
+                <w:sz w:val="20"/>
+                <w:szCs w:val="20"/>
+              </w:rPr>
+              <w:br/>
+            </w:r>
+          </w:p>
+          <w:p>
+            <w:pPr>
+              <w:pStyle w:val="PargrafodaLista"/>
+              <w:numPr>
+                <w:ilvl w:val="0"/>
+                <w:numId w:val="8"/>
+              </w:numPr>
+            </w:pPr>
+            <w:r>
+              <w:rPr>
+                <w:sz w:val="20"/>
+                <w:szCs w:val="20"/>
+              </w:rPr>
+              <w:t>Comparar características sociodemográficas e nutricionais entre os grupos (Tabela 1 — a ser construída após análise exploratória dos dados).</w:t>
             </w:r>
           </w:p>
         </w:tc>
@@ -51489,23 +50564,7 @@
                 <w:sz w:val="20"/>
                 <w:szCs w:val="20"/>
               </w:rPr>
-              <w:t xml:space="preserve">Apresentar os resultados de treinamento (F1-Measure com IC 95% — Tabela de resultados, modelo Tabela 2 do artigo DPOC de Melo et al., 2024) e os resultados do conjunto de teste (Gráfico de barras comparando Precisão, Recall e F1-Score de cada algoritmo — modelo Gráfico 1 dos artigos de referência). Indicar qual algoritmo apresentou melhor desempenho global com base no F1-score e no </w:t>
-            </w:r>
-            <w:proofErr w:type="spellStart"/>
-            <w:r>
-              <w:rPr>
-                <w:sz w:val="20"/>
-                <w:szCs w:val="20"/>
-              </w:rPr>
-              <w:t>teste-T</w:t>
-            </w:r>
-            <w:proofErr w:type="spellEnd"/>
-            <w:r>
-              <w:rPr>
-                <w:sz w:val="20"/>
-                <w:szCs w:val="20"/>
-              </w:rPr>
-              <w:t>.</w:t>
+              <w:t>Apresentar os resultados de treinamento (F1-Measure com IC 95% — Tabela de resultados, modelo Tabela 2 do artigo DPOC de Melo et al., 2024) e os resultados do conjunto de teste (Gráfico de barras comparando Precisão, Recall e F1-Score de cada algoritmo — modelo Gráfico 1 dos artigos de referência). Indicar qual algoritmo apresentou melhor desempenho global com base no F1-score e no teste-T.</w:t>
             </w:r>
           </w:p>
         </w:tc>
@@ -51583,39 +50642,7 @@
                 <w:sz w:val="20"/>
                 <w:szCs w:val="20"/>
               </w:rPr>
-              <w:t xml:space="preserve">Apresentar o gráfico de importância de atributos (Feature </w:t>
-            </w:r>
-            <w:proofErr w:type="spellStart"/>
-            <w:r>
-              <w:rPr>
-                <w:sz w:val="20"/>
-                <w:szCs w:val="20"/>
-              </w:rPr>
-              <w:t>Importance</w:t>
-            </w:r>
-            <w:proofErr w:type="spellEnd"/>
-            <w:r>
-              <w:rPr>
-                <w:sz w:val="20"/>
-                <w:szCs w:val="20"/>
-              </w:rPr>
-              <w:t xml:space="preserve">) para os modelos baseados em Árvore de Decisão, Floresta Aleatória e </w:t>
-            </w:r>
-            <w:proofErr w:type="spellStart"/>
-            <w:r>
-              <w:rPr>
-                <w:sz w:val="20"/>
-                <w:szCs w:val="20"/>
-              </w:rPr>
-              <w:t>AdaBoost</w:t>
-            </w:r>
-            <w:proofErr w:type="spellEnd"/>
-            <w:r>
-              <w:rPr>
-                <w:sz w:val="20"/>
-                <w:szCs w:val="20"/>
-              </w:rPr>
-              <w:t xml:space="preserve"> (modelo Gráfico 2 de Melo et al., 2024). Destacar os atributos nutricionais de maior peso preditivo. Reportar eventuais regras extraídas da Árvore de Decisão mais representativas por classe (modelo Tabela de Regras de Gonçalves &amp; Zárate, 2024).</w:t>
+              <w:t>Apresentar o gráfico de importância de atributos (Feature Importance) para os modelos baseados em Árvore de Decisão, Floresta Aleatória e AdaBoost (modelo Gráfico 2 de Melo et al., 2024). Destacar os atributos nutricionais de maior peso preditivo. Reportar eventuais regras extraídas da Árvore de Decisão mais representativas por classe (modelo Tabela de Regras de Gonçalves &amp; Zárate, 2024).</w:t>
             </w:r>
           </w:p>
         </w:tc>
@@ -51643,64 +50670,6 @@
         <w:t>💬  FASE 4 — SEÇÃO DE DISCUSSÃO</w:t>
       </w:r>
     </w:p>
-    <w:p>
-      <w:pPr>
-        <w:spacing w:before="60" w:after="60"/>
-      </w:pPr>
-    </w:p>
-    <w:tbl>
-      <w:tblPr>
-        <w:tblW w:w="9360" w:type="dxa"/>
-        <w:tblBorders>
-          <w:top w:val="single" w:sz="4" w:space="0" w:color="auto"/>
-          <w:left w:val="single" w:sz="4" w:space="0" w:color="auto"/>
-          <w:bottom w:val="single" w:sz="4" w:space="0" w:color="auto"/>
-          <w:right w:val="single" w:sz="4" w:space="0" w:color="auto"/>
-          <w:insideH w:val="single" w:sz="4" w:space="0" w:color="auto"/>
-          <w:insideV w:val="single" w:sz="4" w:space="0" w:color="auto"/>
-        </w:tblBorders>
-        <w:tblCellMar>
-          <w:left w:w="10" w:type="dxa"/>
-          <w:right w:w="10" w:type="dxa"/>
-        </w:tblCellMar>
-        <w:tblLook w:val="0000" w:firstRow="0" w:lastRow="0" w:firstColumn="0" w:lastColumn="0" w:noHBand="0" w:noVBand="0"/>
-      </w:tblPr>
-      <w:tblGrid>
-        <w:gridCol w:w="9360"/>
-      </w:tblGrid>
-      <w:tr>
-        <w:tc>
-          <w:tcPr>
-            <w:tcW w:w="0" w:type="auto"/>
-            <w:tcBorders>
-              <w:top w:val="single" w:sz="1" w:space="0" w:color="AAAAAA"/>
-              <w:left w:val="single" w:sz="1" w:space="0" w:color="AAAAAA"/>
-              <w:bottom w:val="single" w:sz="1" w:space="0" w:color="AAAAAA"/>
-              <w:right w:val="single" w:sz="1" w:space="0" w:color="AAAAAA"/>
-            </w:tcBorders>
-            <w:shd w:val="clear" w:color="auto" w:fill="FFF2CC"/>
-            <w:tcMar>
-              <w:top w:w="80" w:type="dxa"/>
-              <w:left w:w="160" w:type="dxa"/>
-              <w:bottom w:w="80" w:type="dxa"/>
-              <w:right w:w="160" w:type="dxa"/>
-            </w:tcMar>
-          </w:tcPr>
-          <w:p>
-            <w:r>
-              <w:rPr>
-                <w:i/>
-                <w:iCs/>
-                <w:color w:val="7D6608"/>
-                <w:sz w:val="20"/>
-                <w:szCs w:val="20"/>
-              </w:rPr>
-              <w:t>💡 Regra de ouro: a Discussão não deve ultrapassar 1/3 do artigo total. Estruture em tópicos e compare com a literatura — especialmente os trabalhos do orientador que usaram a PNS 2019.</w:t>
-            </w:r>
-          </w:p>
-        </w:tc>
-      </w:tr>
-    </w:tbl>
     <w:p>
       <w:pPr>
         <w:spacing w:before="80" w:after="80"/>
@@ -51842,39 +50811,7 @@
                 <w:sz w:val="20"/>
                 <w:szCs w:val="20"/>
               </w:rPr>
-              <w:t>Sintetizar em 2–3 frases o principal resultado: qual(</w:t>
-            </w:r>
-            <w:proofErr w:type="spellStart"/>
-            <w:r>
-              <w:rPr>
-                <w:sz w:val="20"/>
-                <w:szCs w:val="20"/>
-              </w:rPr>
-              <w:t>is</w:t>
-            </w:r>
-            <w:proofErr w:type="spellEnd"/>
-            <w:r>
-              <w:rPr>
-                <w:sz w:val="20"/>
-                <w:szCs w:val="20"/>
-              </w:rPr>
-              <w:t>) atributo(s) nutricional(</w:t>
-            </w:r>
-            <w:proofErr w:type="spellStart"/>
-            <w:r>
-              <w:rPr>
-                <w:sz w:val="20"/>
-                <w:szCs w:val="20"/>
-              </w:rPr>
-              <w:t>is</w:t>
-            </w:r>
-            <w:proofErr w:type="spellEnd"/>
-            <w:r>
-              <w:rPr>
-                <w:sz w:val="20"/>
-                <w:szCs w:val="20"/>
-              </w:rPr>
-              <w:t>) demonstrou(aram) maior poder discriminatório entre saudáveis e portadores de artrite, e qual algoritmo apresentou melhor desempenho.</w:t>
+              <w:t>Sintetizar em 2–3 frases o principal resultado: qual(is) atributo(s) nutricional(is) demonstrou(aram) maior poder discriminatório entre saudáveis e portadores de artrite, e qual algoritmo apresentou melhor desempenho.</w:t>
             </w:r>
           </w:p>
         </w:tc>
@@ -51932,7 +50869,15 @@
                 <w:sz w:val="20"/>
                 <w:szCs w:val="20"/>
               </w:rPr>
-              <w:t>Design transversal (sem causalidade temporal); dados autorreferidos sujeitos a viés de memória; PNS não registra tempo de exposição dietética; ausência de biomarcadores inflamatórios laboratoriais; baixo N de casos positivos exige balanceamento artificial (RUS).</w:t>
+              <w:t xml:space="preserve">Design transversal (sem causalidade temporal); dados autorreferidos sujeitos a viés de memória; PNS não registra tempo de exposição dietética; ausência de </w:t>
+            </w:r>
+            <w:r>
+              <w:rPr>
+                <w:sz w:val="20"/>
+                <w:szCs w:val="20"/>
+              </w:rPr>
+              <w:lastRenderedPageBreak/>
+              <w:t>biomarcadores inflamatórios laboratoriais; baixo N de casos positivos exige balanceamento artificial (RUS).</w:t>
             </w:r>
           </w:p>
         </w:tc>
@@ -51963,6 +50908,7 @@
                 <w:sz w:val="20"/>
                 <w:szCs w:val="20"/>
               </w:rPr>
+              <w:lastRenderedPageBreak/>
               <w:t>3. Pontos fortes</w:t>
             </w:r>
           </w:p>
@@ -51990,39 +50936,7 @@
                 <w:sz w:val="20"/>
                 <w:szCs w:val="20"/>
               </w:rPr>
-              <w:t>Uso de base nacional representativa (PNS 2019); processo KDD estruturado com método CAPTO; múltiplos algoritmos com comparação robusta (</w:t>
-            </w:r>
-            <w:proofErr w:type="spellStart"/>
-            <w:r>
-              <w:rPr>
-                <w:sz w:val="20"/>
-                <w:szCs w:val="20"/>
-              </w:rPr>
-              <w:t>teste-T</w:t>
-            </w:r>
-            <w:proofErr w:type="spellEnd"/>
-            <w:r>
-              <w:rPr>
-                <w:sz w:val="20"/>
-                <w:szCs w:val="20"/>
-              </w:rPr>
-              <w:t xml:space="preserve">, IC 95%, 10-fold CV); foco na população idosa brasileira com perspectiva multidimensional (nutrição + </w:t>
-            </w:r>
-            <w:proofErr w:type="spellStart"/>
-            <w:r>
-              <w:rPr>
-                <w:sz w:val="20"/>
-                <w:szCs w:val="20"/>
-              </w:rPr>
-              <w:t>sociodemografia</w:t>
-            </w:r>
-            <w:proofErr w:type="spellEnd"/>
-            <w:r>
-              <w:rPr>
-                <w:sz w:val="20"/>
-                <w:szCs w:val="20"/>
-              </w:rPr>
-              <w:t xml:space="preserve"> + saúde mental).</w:t>
+              <w:t>Uso de base nacional representativa (PNS 2019); processo KDD estruturado com método CAPTO; múltiplos algoritmos com comparação robusta (teste-T, IC 95%, 10-fold CV); foco na população idosa brasileira com perspectiva multidimensional (nutrição + sociodemografia + saúde mental).</w:t>
             </w:r>
           </w:p>
         </w:tc>
@@ -52075,37 +50989,12 @@
             </w:tcMar>
           </w:tcPr>
           <w:p>
-            <w:proofErr w:type="spellStart"/>
             <w:r>
               <w:rPr>
                 <w:sz w:val="20"/>
                 <w:szCs w:val="20"/>
               </w:rPr>
-              <w:t>Cancella</w:t>
-            </w:r>
-            <w:proofErr w:type="spellEnd"/>
-            <w:r>
-              <w:rPr>
-                <w:sz w:val="20"/>
-                <w:szCs w:val="20"/>
-              </w:rPr>
-              <w:t xml:space="preserve"> &amp; Zárate (2025): identificou que autopercepção de saúde e deficiência mental são preditores relevantes do perfil artrite-depressão em idosos. Silva &amp; Zárate (2024): Floresta Aleatória com F1=82% para depressão usando PNS 2019 — </w:t>
-            </w:r>
-            <w:proofErr w:type="spellStart"/>
-            <w:r>
-              <w:rPr>
-                <w:sz w:val="20"/>
-                <w:szCs w:val="20"/>
-              </w:rPr>
-              <w:t>valida</w:t>
-            </w:r>
-            <w:proofErr w:type="spellEnd"/>
-            <w:r>
-              <w:rPr>
-                <w:sz w:val="20"/>
-                <w:szCs w:val="20"/>
-              </w:rPr>
-              <w:t xml:space="preserve"> a metodologia. Melo et al. (2024): Random Forest com F1=75% para DPOC — mesma base e abordagem.</w:t>
+              <w:t>Cancella &amp; Zárate (2025): identificou que autopercepção de saúde e deficiência mental são preditores relevantes do perfil artrite-depressão em idosos. Silva &amp; Zárate (2024): Floresta Aleatória com F1=82% para depressão usando PNS 2019 — valida a metodologia. Melo et al. (2024): Random Forest com F1=75% para DPOC — mesma base e abordagem.</w:t>
             </w:r>
           </w:p>
         </w:tc>
@@ -52193,7 +51082,7 @@
     </w:p>
     <w:p>
       <w:pPr>
-        <w:spacing w:before="60" w:after="60"/>
+        <w:spacing w:before="80" w:after="80"/>
       </w:pPr>
     </w:p>
     <w:tbl>
@@ -52226,24 +51115,52 @@
               <w:bottom w:val="single" w:sz="1" w:space="0" w:color="AAAAAA"/>
               <w:right w:val="single" w:sz="1" w:space="0" w:color="AAAAAA"/>
             </w:tcBorders>
-            <w:shd w:val="clear" w:color="auto" w:fill="FFF2CC"/>
+            <w:shd w:val="clear" w:color="auto" w:fill="D6E4F0"/>
             <w:tcMar>
               <w:top w:w="80" w:type="dxa"/>
-              <w:left w:w="160" w:type="dxa"/>
-              <w:bottom w:w="80" w:type="dxa"/>
-              <w:right w:w="160" w:type="dxa"/>
+              <w:left w:w="120" w:type="dxa"/>
+              <w:bottom w:w="40" w:type="dxa"/>
+              <w:right w:w="120" w:type="dxa"/>
             </w:tcMar>
           </w:tcPr>
           <w:p>
             <w:r>
               <w:rPr>
-                <w:i/>
-                <w:iCs/>
-                <w:color w:val="7D6608"/>
+                <w:b/>
+                <w:bCs/>
                 <w:sz w:val="20"/>
                 <w:szCs w:val="20"/>
               </w:rPr>
-              <w:t>💡 A Introdução é escrita DEPOIS de redigir Resultados e Discussão. Deve ser curta e terminar com o objetivo. Siga o padrão dos artigos de referência: contextualização (1 parágrafo), lacuna (1 parágrafo), objetivo (1 parágrafo).</w:t>
+              <w:t>Contextualização — O que a literatura já sabe?</w:t>
+            </w:r>
+          </w:p>
+        </w:tc>
+      </w:tr>
+      <w:tr>
+        <w:tc>
+          <w:tcPr>
+            <w:tcW w:w="0" w:type="auto"/>
+            <w:tcBorders>
+              <w:top w:val="single" w:sz="1" w:space="0" w:color="AAAAAA"/>
+              <w:left w:val="single" w:sz="1" w:space="0" w:color="AAAAAA"/>
+              <w:bottom w:val="single" w:sz="1" w:space="0" w:color="AAAAAA"/>
+              <w:right w:val="single" w:sz="1" w:space="0" w:color="AAAAAA"/>
+            </w:tcBorders>
+            <w:shd w:val="clear" w:color="auto" w:fill="FFFFFF"/>
+            <w:tcMar>
+              <w:top w:w="80" w:type="dxa"/>
+              <w:left w:w="120" w:type="dxa"/>
+              <w:bottom w:w="80" w:type="dxa"/>
+              <w:right w:w="120" w:type="dxa"/>
+            </w:tcMar>
+          </w:tcPr>
+          <w:p>
+            <w:r>
+              <w:rPr>
+                <w:sz w:val="20"/>
+                <w:szCs w:val="20"/>
+              </w:rPr>
+              <w:t>A artrite e o reumatismo são condições crônicas de alta prevalência entre idosos, causando dor articular, limitação funcional e redução da qualidade de vida. A dieta é reconhecida como o principal fator ambiental modulador da inflamação sistêmica, e o consumo de ultraprocessados está associado à progressão de doenças articulares. No Brasil, segundo a PNS 2019, doenças osteoarticulares afetam percentual expressivo da população idosa, representando importante carga para o sistema de saúde. O envelhecimento acelerado da população brasileira torna urgente a identificação de perfis de risco e o desenvolvimento de estratégias preventivas baseadas em dados populacionais.</w:t>
             </w:r>
           </w:p>
         </w:tc>
@@ -52300,7 +51217,7 @@
                 <w:sz w:val="20"/>
                 <w:szCs w:val="20"/>
               </w:rPr>
-              <w:t>Contextualização — O que a literatura já sabe?</w:t>
+              <w:t>Lacuna — O que NÃO se sabe?</w:t>
             </w:r>
           </w:p>
         </w:tc>
@@ -52329,101 +51246,7 @@
                 <w:sz w:val="20"/>
                 <w:szCs w:val="20"/>
               </w:rPr>
-              <w:t>A artrite e o reumatismo são condições crônicas de alta prevalência entre idosos, causando dor articular, limitação funcional e redução da qualidade de vida. A dieta é reconhecida como o principal fator ambiental modulador da inflamação sistêmica, e o consumo de ultraprocessados está associado à progressão de doenças articulares. No Brasil, segundo a PNS 2019, doenças osteoarticulares afetam percentual expressivo da população idosa, representando importante carga para o sistema de saúde. O envelhecimento acelerado da população brasileira torna urgente a identificação de perfis de risco e o desenvolvimento de estratégias preventivas baseadas em dados populacionais.</w:t>
-            </w:r>
-          </w:p>
-        </w:tc>
-      </w:tr>
-    </w:tbl>
-    <w:p>
-      <w:pPr>
-        <w:spacing w:before="80" w:after="80"/>
-      </w:pPr>
-    </w:p>
-    <w:tbl>
-      <w:tblPr>
-        <w:tblW w:w="9360" w:type="dxa"/>
-        <w:tblBorders>
-          <w:top w:val="single" w:sz="4" w:space="0" w:color="auto"/>
-          <w:left w:val="single" w:sz="4" w:space="0" w:color="auto"/>
-          <w:bottom w:val="single" w:sz="4" w:space="0" w:color="auto"/>
-          <w:right w:val="single" w:sz="4" w:space="0" w:color="auto"/>
-          <w:insideH w:val="single" w:sz="4" w:space="0" w:color="auto"/>
-          <w:insideV w:val="single" w:sz="4" w:space="0" w:color="auto"/>
-        </w:tblBorders>
-        <w:tblCellMar>
-          <w:left w:w="10" w:type="dxa"/>
-          <w:right w:w="10" w:type="dxa"/>
-        </w:tblCellMar>
-        <w:tblLook w:val="0000" w:firstRow="0" w:lastRow="0" w:firstColumn="0" w:lastColumn="0" w:noHBand="0" w:noVBand="0"/>
-      </w:tblPr>
-      <w:tblGrid>
-        <w:gridCol w:w="9360"/>
-      </w:tblGrid>
-      <w:tr>
-        <w:tc>
-          <w:tcPr>
-            <w:tcW w:w="0" w:type="auto"/>
-            <w:tcBorders>
-              <w:top w:val="single" w:sz="1" w:space="0" w:color="AAAAAA"/>
-              <w:left w:val="single" w:sz="1" w:space="0" w:color="AAAAAA"/>
-              <w:bottom w:val="single" w:sz="1" w:space="0" w:color="AAAAAA"/>
-              <w:right w:val="single" w:sz="1" w:space="0" w:color="AAAAAA"/>
-            </w:tcBorders>
-            <w:shd w:val="clear" w:color="auto" w:fill="D6E4F0"/>
-            <w:tcMar>
-              <w:top w:w="80" w:type="dxa"/>
-              <w:left w:w="120" w:type="dxa"/>
-              <w:bottom w:w="40" w:type="dxa"/>
-              <w:right w:w="120" w:type="dxa"/>
-            </w:tcMar>
-          </w:tcPr>
-          <w:p>
-            <w:r>
-              <w:rPr>
-                <w:b/>
-                <w:bCs/>
-                <w:sz w:val="20"/>
-                <w:szCs w:val="20"/>
-              </w:rPr>
-              <w:t>Lacuna — O que NÃO se sabe?</w:t>
-            </w:r>
-          </w:p>
-        </w:tc>
-      </w:tr>
-      <w:tr>
-        <w:tc>
-          <w:tcPr>
-            <w:tcW w:w="0" w:type="auto"/>
-            <w:tcBorders>
-              <w:top w:val="single" w:sz="1" w:space="0" w:color="AAAAAA"/>
-              <w:left w:val="single" w:sz="1" w:space="0" w:color="AAAAAA"/>
-              <w:bottom w:val="single" w:sz="1" w:space="0" w:color="AAAAAA"/>
-              <w:right w:val="single" w:sz="1" w:space="0" w:color="AAAAAA"/>
-            </w:tcBorders>
-            <w:shd w:val="clear" w:color="auto" w:fill="FFFFFF"/>
-            <w:tcMar>
-              <w:top w:w="80" w:type="dxa"/>
-              <w:left w:w="120" w:type="dxa"/>
-              <w:bottom w:w="80" w:type="dxa"/>
-              <w:right w:w="120" w:type="dxa"/>
-            </w:tcMar>
-          </w:tcPr>
-          <w:p>
-            <w:r>
-              <w:rPr>
-                <w:sz w:val="20"/>
-                <w:szCs w:val="20"/>
-              </w:rPr>
-              <w:t xml:space="preserve">Apesar dos avanços na compreensão clínica da artrite, há escassez de estudos que combinem técnicas de mineração de dados e aprendizado de máquina supervisionado para caracterizar o perfil nutricional de idosos com artrite no contexto brasileiro, utilizando dados populacionais representativos. </w:t>
-            </w:r>
-            <w:r>
-              <w:rPr>
-                <w:sz w:val="20"/>
-                <w:szCs w:val="20"/>
-              </w:rPr>
-              <w:lastRenderedPageBreak/>
-              <w:t>A aplicação do processo KDD com o método CAPTO e múltiplos algoritmos classificadores ainda não foi explorada especificamente para esta condição na população idosa nacional.</w:t>
+              <w:t>Apesar dos avanços na compreensão clínica da artrite, há escassez de estudos que combinem técnicas de mineração de dados e aprendizado de máquina supervisionado para caracterizar o perfil nutricional de idosos com artrite no contexto brasileiro, utilizando dados populacionais representativos. A aplicação do processo KDD com o método CAPTO e múltiplos algoritmos classificadores ainda não foi explorada especificamente para esta condição na população idosa nacional.</w:t>
             </w:r>
           </w:p>
         </w:tc>
@@ -52633,7 +51456,6 @@
             </w:tcMar>
           </w:tcPr>
           <w:p>
-            <w:proofErr w:type="spellStart"/>
             <w:r>
               <w:rPr>
                 <w:b/>
@@ -52641,17 +51463,7 @@
                 <w:sz w:val="19"/>
                 <w:szCs w:val="19"/>
               </w:rPr>
-              <w:t>Cancella</w:t>
-            </w:r>
-            <w:proofErr w:type="spellEnd"/>
-            <w:r>
-              <w:rPr>
-                <w:b/>
-                <w:bCs/>
-                <w:sz w:val="19"/>
-                <w:szCs w:val="19"/>
-              </w:rPr>
-              <w:t xml:space="preserve"> &amp; Zárate, 2025</w:t>
+              <w:t>Cancella &amp; Zárate, 2025</w:t>
             </w:r>
           </w:p>
         </w:tc>
@@ -52934,21 +51746,12 @@
             </w:tcMar>
           </w:tcPr>
           <w:p>
-            <w:proofErr w:type="spellStart"/>
             <w:r>
               <w:rPr>
                 <w:sz w:val="19"/>
                 <w:szCs w:val="19"/>
               </w:rPr>
-              <w:t>Valida</w:t>
-            </w:r>
-            <w:proofErr w:type="spellEnd"/>
-            <w:r>
-              <w:rPr>
-                <w:sz w:val="19"/>
-                <w:szCs w:val="19"/>
-              </w:rPr>
-              <w:t xml:space="preserve"> a abordagem metodológica; F1=82% com Floresta Aleatória.</w:t>
+              <w:t>Valida a abordagem metodológica; F1=82% com Floresta Aleatória.</w:t>
             </w:r>
           </w:p>
         </w:tc>
@@ -53155,119 +51958,7 @@
                 <w:sz w:val="19"/>
                 <w:szCs w:val="19"/>
               </w:rPr>
-              <w:t xml:space="preserve">CAPTO — A </w:t>
-            </w:r>
-            <w:proofErr w:type="spellStart"/>
-            <w:r>
-              <w:rPr>
-                <w:sz w:val="19"/>
-                <w:szCs w:val="19"/>
-              </w:rPr>
-              <w:t>method</w:t>
-            </w:r>
-            <w:proofErr w:type="spellEnd"/>
-            <w:r>
-              <w:rPr>
-                <w:sz w:val="19"/>
-                <w:szCs w:val="19"/>
-              </w:rPr>
-              <w:t xml:space="preserve"> for </w:t>
-            </w:r>
-            <w:proofErr w:type="spellStart"/>
-            <w:r>
-              <w:rPr>
-                <w:sz w:val="19"/>
-                <w:szCs w:val="19"/>
-              </w:rPr>
-              <w:t>understanding</w:t>
-            </w:r>
-            <w:proofErr w:type="spellEnd"/>
-            <w:r>
-              <w:rPr>
-                <w:sz w:val="19"/>
-                <w:szCs w:val="19"/>
-              </w:rPr>
-              <w:t xml:space="preserve"> </w:t>
-            </w:r>
-            <w:proofErr w:type="spellStart"/>
-            <w:r>
-              <w:rPr>
-                <w:sz w:val="19"/>
-                <w:szCs w:val="19"/>
-              </w:rPr>
-              <w:t>problem</w:t>
-            </w:r>
-            <w:proofErr w:type="spellEnd"/>
-            <w:r>
-              <w:rPr>
-                <w:sz w:val="19"/>
-                <w:szCs w:val="19"/>
-              </w:rPr>
-              <w:t xml:space="preserve"> </w:t>
-            </w:r>
-            <w:proofErr w:type="spellStart"/>
-            <w:r>
-              <w:rPr>
-                <w:sz w:val="19"/>
-                <w:szCs w:val="19"/>
-              </w:rPr>
-              <w:t>domains</w:t>
-            </w:r>
-            <w:proofErr w:type="spellEnd"/>
-            <w:r>
-              <w:rPr>
-                <w:sz w:val="19"/>
-                <w:szCs w:val="19"/>
-              </w:rPr>
-              <w:t xml:space="preserve"> for data </w:t>
-            </w:r>
-            <w:proofErr w:type="spellStart"/>
-            <w:r>
-              <w:rPr>
-                <w:sz w:val="19"/>
-                <w:szCs w:val="19"/>
-              </w:rPr>
-              <w:t>science</w:t>
-            </w:r>
-            <w:proofErr w:type="spellEnd"/>
-            <w:r>
-              <w:rPr>
-                <w:sz w:val="19"/>
-                <w:szCs w:val="19"/>
-              </w:rPr>
-              <w:t xml:space="preserve"> </w:t>
-            </w:r>
-            <w:proofErr w:type="spellStart"/>
-            <w:r>
-              <w:rPr>
-                <w:sz w:val="19"/>
-                <w:szCs w:val="19"/>
-              </w:rPr>
-              <w:t>projects</w:t>
-            </w:r>
-            <w:proofErr w:type="spellEnd"/>
-            <w:r>
-              <w:rPr>
-                <w:sz w:val="19"/>
-                <w:szCs w:val="19"/>
-              </w:rPr>
-              <w:t xml:space="preserve">. </w:t>
-            </w:r>
-            <w:proofErr w:type="spellStart"/>
-            <w:r>
-              <w:rPr>
-                <w:sz w:val="19"/>
-                <w:szCs w:val="19"/>
-              </w:rPr>
-              <w:t>Concilium</w:t>
-            </w:r>
-            <w:proofErr w:type="spellEnd"/>
-            <w:r>
-              <w:rPr>
-                <w:sz w:val="19"/>
-                <w:szCs w:val="19"/>
-              </w:rPr>
-              <w:t>.</w:t>
+              <w:t>CAPTO — A method for understanding problem domains for data science projects. Concilium.</w:t>
             </w:r>
           </w:p>
         </w:tc>
@@ -53328,6 +52019,7 @@
                 <w:sz w:val="19"/>
                 <w:szCs w:val="19"/>
               </w:rPr>
+              <w:lastRenderedPageBreak/>
               <w:t>6</w:t>
             </w:r>
           </w:p>
@@ -53379,133 +52071,12 @@
             </w:tcMar>
           </w:tcPr>
           <w:p>
-            <w:proofErr w:type="spellStart"/>
             <w:r>
               <w:rPr>
                 <w:sz w:val="19"/>
                 <w:szCs w:val="19"/>
               </w:rPr>
-              <w:t>Association</w:t>
-            </w:r>
-            <w:proofErr w:type="spellEnd"/>
-            <w:r>
-              <w:rPr>
-                <w:sz w:val="19"/>
-                <w:szCs w:val="19"/>
-              </w:rPr>
-              <w:t xml:space="preserve"> </w:t>
-            </w:r>
-            <w:proofErr w:type="spellStart"/>
-            <w:r>
-              <w:rPr>
-                <w:sz w:val="19"/>
-                <w:szCs w:val="19"/>
-              </w:rPr>
-              <w:t>between</w:t>
-            </w:r>
-            <w:proofErr w:type="spellEnd"/>
-            <w:r>
-              <w:rPr>
-                <w:sz w:val="19"/>
-                <w:szCs w:val="19"/>
-              </w:rPr>
-              <w:t xml:space="preserve"> </w:t>
-            </w:r>
-            <w:proofErr w:type="spellStart"/>
-            <w:r>
-              <w:rPr>
-                <w:sz w:val="19"/>
-                <w:szCs w:val="19"/>
-              </w:rPr>
-              <w:t>arthritis</w:t>
-            </w:r>
-            <w:proofErr w:type="spellEnd"/>
-            <w:r>
-              <w:rPr>
-                <w:sz w:val="19"/>
-                <w:szCs w:val="19"/>
-              </w:rPr>
-              <w:t xml:space="preserve"> </w:t>
-            </w:r>
-            <w:proofErr w:type="spellStart"/>
-            <w:r>
-              <w:rPr>
-                <w:sz w:val="19"/>
-                <w:szCs w:val="19"/>
-              </w:rPr>
-              <w:t>and</w:t>
-            </w:r>
-            <w:proofErr w:type="spellEnd"/>
-            <w:r>
-              <w:rPr>
-                <w:sz w:val="19"/>
-                <w:szCs w:val="19"/>
-              </w:rPr>
-              <w:t xml:space="preserve"> </w:t>
-            </w:r>
-            <w:proofErr w:type="spellStart"/>
-            <w:r>
-              <w:rPr>
-                <w:sz w:val="19"/>
-                <w:szCs w:val="19"/>
-              </w:rPr>
-              <w:t>depression</w:t>
-            </w:r>
-            <w:proofErr w:type="spellEnd"/>
-            <w:r>
-              <w:rPr>
-                <w:sz w:val="19"/>
-                <w:szCs w:val="19"/>
-              </w:rPr>
-              <w:t xml:space="preserve"> </w:t>
-            </w:r>
-            <w:proofErr w:type="spellStart"/>
-            <w:r>
-              <w:rPr>
-                <w:sz w:val="19"/>
-                <w:szCs w:val="19"/>
-              </w:rPr>
-              <w:t>risk</w:t>
-            </w:r>
-            <w:proofErr w:type="spellEnd"/>
-            <w:r>
-              <w:rPr>
-                <w:sz w:val="19"/>
-                <w:szCs w:val="19"/>
-              </w:rPr>
-              <w:t xml:space="preserve">. J </w:t>
-            </w:r>
-            <w:proofErr w:type="spellStart"/>
-            <w:r>
-              <w:rPr>
-                <w:sz w:val="19"/>
-                <w:szCs w:val="19"/>
-              </w:rPr>
-              <w:t>Affect</w:t>
-            </w:r>
-            <w:proofErr w:type="spellEnd"/>
-            <w:r>
-              <w:rPr>
-                <w:sz w:val="19"/>
-                <w:szCs w:val="19"/>
-              </w:rPr>
-              <w:t xml:space="preserve"> </w:t>
-            </w:r>
-            <w:proofErr w:type="spellStart"/>
-            <w:r>
-              <w:rPr>
-                <w:sz w:val="19"/>
-                <w:szCs w:val="19"/>
-              </w:rPr>
-              <w:t>Disord</w:t>
-            </w:r>
-            <w:proofErr w:type="spellEnd"/>
-            <w:r>
-              <w:rPr>
-                <w:sz w:val="19"/>
-                <w:szCs w:val="19"/>
-              </w:rPr>
-              <w:t>.</w:t>
+              <w:t>Association between arthritis and depression risk. J Affect Disord.</w:t>
             </w:r>
           </w:p>
         </w:tc>
@@ -53794,64 +52365,6 @@
         <w:t>📄  FASE 6 — RESUMO E PALAVRAS-CHAVE</w:t>
       </w:r>
     </w:p>
-    <w:p>
-      <w:pPr>
-        <w:spacing w:before="60" w:after="60"/>
-      </w:pPr>
-    </w:p>
-    <w:tbl>
-      <w:tblPr>
-        <w:tblW w:w="9360" w:type="dxa"/>
-        <w:tblBorders>
-          <w:top w:val="single" w:sz="4" w:space="0" w:color="auto"/>
-          <w:left w:val="single" w:sz="4" w:space="0" w:color="auto"/>
-          <w:bottom w:val="single" w:sz="4" w:space="0" w:color="auto"/>
-          <w:right w:val="single" w:sz="4" w:space="0" w:color="auto"/>
-          <w:insideH w:val="single" w:sz="4" w:space="0" w:color="auto"/>
-          <w:insideV w:val="single" w:sz="4" w:space="0" w:color="auto"/>
-        </w:tblBorders>
-        <w:tblCellMar>
-          <w:left w:w="10" w:type="dxa"/>
-          <w:right w:w="10" w:type="dxa"/>
-        </w:tblCellMar>
-        <w:tblLook w:val="0000" w:firstRow="0" w:lastRow="0" w:firstColumn="0" w:lastColumn="0" w:noHBand="0" w:noVBand="0"/>
-      </w:tblPr>
-      <w:tblGrid>
-        <w:gridCol w:w="9360"/>
-      </w:tblGrid>
-      <w:tr>
-        <w:tc>
-          <w:tcPr>
-            <w:tcW w:w="0" w:type="auto"/>
-            <w:tcBorders>
-              <w:top w:val="single" w:sz="1" w:space="0" w:color="AAAAAA"/>
-              <w:left w:val="single" w:sz="1" w:space="0" w:color="AAAAAA"/>
-              <w:bottom w:val="single" w:sz="1" w:space="0" w:color="AAAAAA"/>
-              <w:right w:val="single" w:sz="1" w:space="0" w:color="AAAAAA"/>
-            </w:tcBorders>
-            <w:shd w:val="clear" w:color="auto" w:fill="FFF2CC"/>
-            <w:tcMar>
-              <w:top w:w="80" w:type="dxa"/>
-              <w:left w:w="160" w:type="dxa"/>
-              <w:bottom w:w="80" w:type="dxa"/>
-              <w:right w:w="160" w:type="dxa"/>
-            </w:tcMar>
-          </w:tcPr>
-          <w:p>
-            <w:r>
-              <w:rPr>
-                <w:i/>
-                <w:iCs/>
-                <w:color w:val="7D6608"/>
-                <w:sz w:val="20"/>
-                <w:szCs w:val="20"/>
-              </w:rPr>
-              <w:t>💡 O resumo é escrito por ÚLTIMO, mas é a parte mais lida. Objetivo e conclusão DEVEM combinar. Escreva em português, inglês e espanhol conforme padrão do JHI/SBIS.</w:t>
-            </w:r>
-          </w:p>
-        </w:tc>
-      </w:tr>
-    </w:tbl>
     <w:p>
       <w:pPr>
         <w:spacing w:before="80" w:after="80"/>
@@ -54051,87 +52564,7 @@
                 <w:sz w:val="20"/>
                 <w:szCs w:val="20"/>
               </w:rPr>
-              <w:t xml:space="preserve">Estudo transversal baseado na PNS 2019 (IBGE). Aplicou-se o processo KDD com o método CAPTO para seleção conceitual de atributos. Os modelos de classificação foram: Árvore de Decisão, Floresta Aleatória, </w:t>
-            </w:r>
-            <w:proofErr w:type="spellStart"/>
-            <w:r>
-              <w:rPr>
-                <w:sz w:val="20"/>
-                <w:szCs w:val="20"/>
-              </w:rPr>
-              <w:t>Naive</w:t>
-            </w:r>
-            <w:proofErr w:type="spellEnd"/>
-            <w:r>
-              <w:rPr>
-                <w:sz w:val="20"/>
-                <w:szCs w:val="20"/>
-              </w:rPr>
-              <w:t xml:space="preserve"> </w:t>
-            </w:r>
-            <w:proofErr w:type="spellStart"/>
-            <w:r>
-              <w:rPr>
-                <w:sz w:val="20"/>
-                <w:szCs w:val="20"/>
-              </w:rPr>
-              <w:t>Bayes</w:t>
-            </w:r>
-            <w:proofErr w:type="spellEnd"/>
-            <w:r>
-              <w:rPr>
-                <w:sz w:val="20"/>
-                <w:szCs w:val="20"/>
-              </w:rPr>
-              <w:t xml:space="preserve"> e </w:t>
-            </w:r>
-            <w:proofErr w:type="spellStart"/>
-            <w:r>
-              <w:rPr>
-                <w:sz w:val="20"/>
-                <w:szCs w:val="20"/>
-              </w:rPr>
-              <w:t>AdaBoost</w:t>
-            </w:r>
-            <w:proofErr w:type="spellEnd"/>
-            <w:r>
-              <w:rPr>
-                <w:sz w:val="20"/>
-                <w:szCs w:val="20"/>
-              </w:rPr>
-              <w:t xml:space="preserve">, com validação cruzada 10-fold e balanceamento por Random </w:t>
-            </w:r>
-            <w:proofErr w:type="spellStart"/>
-            <w:r>
-              <w:rPr>
-                <w:sz w:val="20"/>
-                <w:szCs w:val="20"/>
-              </w:rPr>
-              <w:t>Under</w:t>
-            </w:r>
-            <w:proofErr w:type="spellEnd"/>
-            <w:r>
-              <w:rPr>
-                <w:sz w:val="20"/>
-                <w:szCs w:val="20"/>
-              </w:rPr>
-              <w:t xml:space="preserve"> </w:t>
-            </w:r>
-            <w:proofErr w:type="spellStart"/>
-            <w:r>
-              <w:rPr>
-                <w:sz w:val="20"/>
-                <w:szCs w:val="20"/>
-              </w:rPr>
-              <w:t>Sampler</w:t>
-            </w:r>
-            <w:proofErr w:type="spellEnd"/>
-            <w:r>
-              <w:rPr>
-                <w:sz w:val="20"/>
-                <w:szCs w:val="20"/>
-              </w:rPr>
-              <w:t>.</w:t>
+              <w:t>Estudo transversal baseado na PNS 2019 (IBGE). Aplicou-se o processo KDD com o método CAPTO para seleção conceitual de atributos. Os modelos de classificação foram: Árvore de Decisão, Floresta Aleatória, Naive Bayes e AdaBoost, com validação cruzada 10-fold e balanceamento por Random Under Sampler.</w:t>
             </w:r>
           </w:p>
         </w:tc>
@@ -54192,29 +52625,7 @@
                 <w:sz w:val="20"/>
                 <w:szCs w:val="20"/>
               </w:rPr>
-              <w:t xml:space="preserve">[A preencher após a execução dos experimentos. Indicar o melhor algoritmo, F1-score obtido e os principais atributos identificados pelo Feature </w:t>
-            </w:r>
-            <w:proofErr w:type="spellStart"/>
-            <w:r>
-              <w:rPr>
-                <w:i/>
-                <w:iCs/>
-                <w:color w:val="888888"/>
-                <w:sz w:val="20"/>
-                <w:szCs w:val="20"/>
-              </w:rPr>
-              <w:t>Importance</w:t>
-            </w:r>
-            <w:proofErr w:type="spellEnd"/>
-            <w:r>
-              <w:rPr>
-                <w:i/>
-                <w:iCs/>
-                <w:color w:val="888888"/>
-                <w:sz w:val="20"/>
-                <w:szCs w:val="20"/>
-              </w:rPr>
-              <w:t>.]</w:t>
+              <w:t>[A preencher após a execução dos experimentos. Indicar o melhor algoritmo, F1-score obtido e os principais atributos identificados pelo Feature Importance.]</w:t>
             </w:r>
           </w:p>
         </w:tc>
@@ -54647,52 +53058,7 @@
           <w:sz w:val="19"/>
           <w:szCs w:val="19"/>
         </w:rPr>
-        <w:lastRenderedPageBreak/>
-        <w:t>Palavras-chave (</w:t>
-      </w:r>
-      <w:proofErr w:type="spellStart"/>
-      <w:r>
-        <w:rPr>
-          <w:i/>
-          <w:iCs/>
-          <w:color w:val="595959"/>
-          <w:sz w:val="19"/>
-          <w:szCs w:val="19"/>
-        </w:rPr>
-        <w:t>DeCS</w:t>
-      </w:r>
-      <w:proofErr w:type="spellEnd"/>
-      <w:r>
-        <w:rPr>
-          <w:i/>
-          <w:iCs/>
-          <w:color w:val="595959"/>
-          <w:sz w:val="19"/>
-          <w:szCs w:val="19"/>
-        </w:rPr>
-        <w:t>/</w:t>
-      </w:r>
-      <w:proofErr w:type="spellStart"/>
-      <w:r>
-        <w:rPr>
-          <w:i/>
-          <w:iCs/>
-          <w:color w:val="595959"/>
-          <w:sz w:val="19"/>
-          <w:szCs w:val="19"/>
-        </w:rPr>
-        <w:t>MeSH</w:t>
-      </w:r>
-      <w:proofErr w:type="spellEnd"/>
-      <w:r>
-        <w:rPr>
-          <w:i/>
-          <w:iCs/>
-          <w:color w:val="595959"/>
-          <w:sz w:val="19"/>
-          <w:szCs w:val="19"/>
-        </w:rPr>
-        <w:t>): Artrite / Mineração de Dados / Aprendizado de Máquina / Saúde do Idoso / Pesquisa Nacional de Saúde</w:t>
+        <w:t>Palavras-chave (DeCS/MeSH): Artrite / Mineração de Dados / Aprendizado de Máquina / Saúde do Idoso / Pesquisa Nacional de Saúde</w:t>
       </w:r>
     </w:p>
     <w:p>
@@ -54714,89 +53080,29 @@
           <w:sz w:val="26"/>
           <w:szCs w:val="26"/>
         </w:rPr>
-        <w:t>✅  FASE 7 — CHECKLIST FINAL DE REVISÃO</w:t>
+        <w:t xml:space="preserve">✅  FASE 7 — CHECKLIST </w:t>
+      </w:r>
+      <w:r>
+        <w:rPr>
+          <w:b/>
+          <w:bCs/>
+          <w:color w:val="FFFFFF"/>
+          <w:sz w:val="26"/>
+          <w:szCs w:val="26"/>
+        </w:rPr>
+        <w:t xml:space="preserve">DO ZARATE </w:t>
+      </w:r>
+      <w:r>
+        <w:rPr>
+          <w:b/>
+          <w:bCs/>
+          <w:color w:val="FFFFFF"/>
+          <w:sz w:val="26"/>
+          <w:szCs w:val="26"/>
+        </w:rPr>
+        <w:t>FINAL DE REVISÃO</w:t>
       </w:r>
     </w:p>
-    <w:p>
-      <w:pPr>
-        <w:spacing w:before="60" w:after="60"/>
-      </w:pPr>
-    </w:p>
-    <w:tbl>
-      <w:tblPr>
-        <w:tblW w:w="9360" w:type="dxa"/>
-        <w:tblBorders>
-          <w:top w:val="single" w:sz="4" w:space="0" w:color="auto"/>
-          <w:left w:val="single" w:sz="4" w:space="0" w:color="auto"/>
-          <w:bottom w:val="single" w:sz="4" w:space="0" w:color="auto"/>
-          <w:right w:val="single" w:sz="4" w:space="0" w:color="auto"/>
-          <w:insideH w:val="single" w:sz="4" w:space="0" w:color="auto"/>
-          <w:insideV w:val="single" w:sz="4" w:space="0" w:color="auto"/>
-        </w:tblBorders>
-        <w:tblCellMar>
-          <w:left w:w="10" w:type="dxa"/>
-          <w:right w:w="10" w:type="dxa"/>
-        </w:tblCellMar>
-        <w:tblLook w:val="0000" w:firstRow="0" w:lastRow="0" w:firstColumn="0" w:lastColumn="0" w:noHBand="0" w:noVBand="0"/>
-      </w:tblPr>
-      <w:tblGrid>
-        <w:gridCol w:w="9360"/>
-      </w:tblGrid>
-      <w:tr>
-        <w:tc>
-          <w:tcPr>
-            <w:tcW w:w="0" w:type="auto"/>
-            <w:tcBorders>
-              <w:top w:val="single" w:sz="1" w:space="0" w:color="AAAAAA"/>
-              <w:left w:val="single" w:sz="1" w:space="0" w:color="AAAAAA"/>
-              <w:bottom w:val="single" w:sz="1" w:space="0" w:color="AAAAAA"/>
-              <w:right w:val="single" w:sz="1" w:space="0" w:color="AAAAAA"/>
-            </w:tcBorders>
-            <w:shd w:val="clear" w:color="auto" w:fill="FFF2CC"/>
-            <w:tcMar>
-              <w:top w:w="80" w:type="dxa"/>
-              <w:left w:w="160" w:type="dxa"/>
-              <w:bottom w:w="80" w:type="dxa"/>
-              <w:right w:w="160" w:type="dxa"/>
-            </w:tcMar>
-          </w:tcPr>
-          <w:p>
-            <w:r>
-              <w:rPr>
-                <w:i/>
-                <w:iCs/>
-                <w:color w:val="7D6608"/>
-                <w:sz w:val="20"/>
-                <w:szCs w:val="20"/>
-              </w:rPr>
-              <w:t xml:space="preserve">💡 Marque cada item ao completar a verificação. </w:t>
-            </w:r>
-            <w:proofErr w:type="spellStart"/>
-            <w:r>
-              <w:rPr>
-                <w:i/>
-                <w:iCs/>
-                <w:color w:val="7D6608"/>
-                <w:sz w:val="20"/>
-                <w:szCs w:val="20"/>
-              </w:rPr>
-              <w:t>Lembre</w:t>
-            </w:r>
-            <w:proofErr w:type="spellEnd"/>
-            <w:r>
-              <w:rPr>
-                <w:i/>
-                <w:iCs/>
-                <w:color w:val="7D6608"/>
-                <w:sz w:val="20"/>
-                <w:szCs w:val="20"/>
-              </w:rPr>
-              <w:t>: revisar, revisar, revisar!</w:t>
-            </w:r>
-          </w:p>
-        </w:tc>
-      </w:tr>
-    </w:tbl>
     <w:p>
       <w:pPr>
         <w:spacing w:before="80" w:after="80"/>
@@ -55396,6 +53702,7 @@
               <w:jc w:val="center"/>
             </w:pPr>
             <w:r>
+              <w:lastRenderedPageBreak/>
               <w:t>☐</w:t>
             </w:r>
           </w:p>
@@ -55478,39 +53785,7 @@
                 <w:sz w:val="20"/>
                 <w:szCs w:val="20"/>
               </w:rPr>
-              <w:t xml:space="preserve">As palavras-chave foram selecionadas no </w:t>
-            </w:r>
-            <w:proofErr w:type="spellStart"/>
-            <w:r>
-              <w:rPr>
-                <w:sz w:val="20"/>
-                <w:szCs w:val="20"/>
-              </w:rPr>
-              <w:t>MeSH</w:t>
-            </w:r>
-            <w:proofErr w:type="spellEnd"/>
-            <w:r>
-              <w:rPr>
-                <w:sz w:val="20"/>
-                <w:szCs w:val="20"/>
-              </w:rPr>
-              <w:t xml:space="preserve"> ou </w:t>
-            </w:r>
-            <w:proofErr w:type="spellStart"/>
-            <w:r>
-              <w:rPr>
-                <w:sz w:val="20"/>
-                <w:szCs w:val="20"/>
-              </w:rPr>
-              <w:t>DeCS</w:t>
-            </w:r>
-            <w:proofErr w:type="spellEnd"/>
-            <w:r>
-              <w:rPr>
-                <w:sz w:val="20"/>
-                <w:szCs w:val="20"/>
-              </w:rPr>
-              <w:t>?</w:t>
+              <w:t>As palavras-chave foram selecionadas no MeSH ou DeCS?</w:t>
             </w:r>
           </w:p>
         </w:tc>
@@ -56177,23 +54452,7 @@
                 <w:sz w:val="20"/>
                 <w:szCs w:val="20"/>
               </w:rPr>
-              <w:t xml:space="preserve">Executar análise exploratória e pré-processamento (outliers, </w:t>
-            </w:r>
-            <w:proofErr w:type="spellStart"/>
-            <w:r>
-              <w:rPr>
-                <w:sz w:val="20"/>
-                <w:szCs w:val="20"/>
-              </w:rPr>
-              <w:t>missing</w:t>
-            </w:r>
-            <w:proofErr w:type="spellEnd"/>
-            <w:r>
-              <w:rPr>
-                <w:sz w:val="20"/>
-                <w:szCs w:val="20"/>
-              </w:rPr>
-              <w:t>, categorização)</w:t>
+              <w:t>Executar análise exploratória e pré-processamento (outliers, missing, categorização)</w:t>
             </w:r>
           </w:p>
         </w:tc>
@@ -56276,23 +54535,7 @@
                 <w:sz w:val="20"/>
                 <w:szCs w:val="20"/>
               </w:rPr>
-              <w:t xml:space="preserve">Treinar os 4 algoritmos com </w:t>
-            </w:r>
-            <w:proofErr w:type="spellStart"/>
-            <w:r>
-              <w:rPr>
-                <w:sz w:val="20"/>
-                <w:szCs w:val="20"/>
-              </w:rPr>
-              <w:t>RandomizedSearchCV</w:t>
-            </w:r>
-            <w:proofErr w:type="spellEnd"/>
-            <w:r>
-              <w:rPr>
-                <w:sz w:val="20"/>
-                <w:szCs w:val="20"/>
-              </w:rPr>
-              <w:t xml:space="preserve"> e validação cruzada 10-fold</w:t>
+              <w:t>Treinar os 4 algoritmos com RandomizedSearchCV e validação cruzada 10-fold</w:t>
             </w:r>
           </w:p>
         </w:tc>
@@ -56375,18 +54618,8 @@
                 <w:sz w:val="20"/>
                 <w:szCs w:val="20"/>
               </w:rPr>
-              <w:lastRenderedPageBreak/>
-              <w:t xml:space="preserve">Gerar gráficos de métricas e Feature </w:t>
-            </w:r>
-            <w:proofErr w:type="spellStart"/>
-            <w:r>
-              <w:rPr>
-                <w:sz w:val="20"/>
-                <w:szCs w:val="20"/>
-              </w:rPr>
-              <w:t>Importance</w:t>
-            </w:r>
-            <w:proofErr w:type="spellEnd"/>
+              <w:t>Gerar gráficos de métricas e Feature Importance</w:t>
+            </w:r>
           </w:p>
         </w:tc>
         <w:tc>
@@ -56634,23 +54867,7 @@
                 <w:sz w:val="20"/>
                 <w:szCs w:val="20"/>
               </w:rPr>
-              <w:t xml:space="preserve">Revisão com o orientador Prof. Dr. </w:t>
-            </w:r>
-            <w:proofErr w:type="spellStart"/>
-            <w:r>
-              <w:rPr>
-                <w:sz w:val="20"/>
-                <w:szCs w:val="20"/>
-              </w:rPr>
-              <w:t>Luis</w:t>
-            </w:r>
-            <w:proofErr w:type="spellEnd"/>
-            <w:r>
-              <w:rPr>
-                <w:sz w:val="20"/>
-                <w:szCs w:val="20"/>
-              </w:rPr>
-              <w:t xml:space="preserve"> Enrique Zárate</w:t>
+              <w:t>Revisão com o orientador Prof. Dr. Luis Enrique Zárate</w:t>
             </w:r>
           </w:p>
         </w:tc>
@@ -56810,29 +55027,7 @@
           <w:sz w:val="18"/>
           <w:szCs w:val="18"/>
         </w:rPr>
-        <w:t xml:space="preserve">Baseado em: Pereira MG &amp; Galvão TF — Epidemiologia e Serviços de Saúde, Brasília, 2012–2014  |  STROBE </w:t>
-      </w:r>
-      <w:proofErr w:type="spellStart"/>
-      <w:r>
-        <w:rPr>
-          <w:i/>
-          <w:iCs/>
-          <w:color w:val="888888"/>
-          <w:sz w:val="18"/>
-          <w:szCs w:val="18"/>
-        </w:rPr>
-        <w:t>Statement</w:t>
-      </w:r>
-      <w:proofErr w:type="spellEnd"/>
-      <w:r>
-        <w:rPr>
-          <w:i/>
-          <w:iCs/>
-          <w:color w:val="888888"/>
-          <w:sz w:val="18"/>
-          <w:szCs w:val="18"/>
-        </w:rPr>
-        <w:t xml:space="preserve"> 2007  |  Linha de Pesquisa LICAP/PUC Minas (Zárate et al.)</w:t>
+        <w:t>Baseado em: Pereira MG &amp; Galvão TF — Epidemiologia e Serviços de Saúde, Brasília, 2012–2014  |  STROBE Statement 2007  |  Linha de Pesquisa LICAP/PUC Minas (Zárate et al.)</w:t>
       </w:r>
     </w:p>
     <w:sectPr>
@@ -57225,6 +55420,92 @@
     </w:lvl>
   </w:abstractNum>
   <w:abstractNum w:abstractNumId="4" w15:restartNumberingAfterBreak="0">
+    <w:nsid w:val="2BA518D6"/>
+    <w:multiLevelType w:val="hybridMultilevel"/>
+    <w:tmpl w:val="E0B63C7A"/>
+    <w:lvl w:ilvl="0" w:tplc="0416000F">
+      <w:start w:val="1"/>
+      <w:numFmt w:val="decimal"/>
+      <w:lvlText w:val="%1."/>
+      <w:lvlJc w:val="left"/>
+      <w:pPr>
+        <w:ind w:left="720" w:hanging="360"/>
+      </w:pPr>
+    </w:lvl>
+    <w:lvl w:ilvl="1" w:tplc="04160019" w:tentative="1">
+      <w:start w:val="1"/>
+      <w:numFmt w:val="lowerLetter"/>
+      <w:lvlText w:val="%2."/>
+      <w:lvlJc w:val="left"/>
+      <w:pPr>
+        <w:ind w:left="1440" w:hanging="360"/>
+      </w:pPr>
+    </w:lvl>
+    <w:lvl w:ilvl="2" w:tplc="0416001B" w:tentative="1">
+      <w:start w:val="1"/>
+      <w:numFmt w:val="lowerRoman"/>
+      <w:lvlText w:val="%3."/>
+      <w:lvlJc w:val="right"/>
+      <w:pPr>
+        <w:ind w:left="2160" w:hanging="180"/>
+      </w:pPr>
+    </w:lvl>
+    <w:lvl w:ilvl="3" w:tplc="0416000F" w:tentative="1">
+      <w:start w:val="1"/>
+      <w:numFmt w:val="decimal"/>
+      <w:lvlText w:val="%4."/>
+      <w:lvlJc w:val="left"/>
+      <w:pPr>
+        <w:ind w:left="2880" w:hanging="360"/>
+      </w:pPr>
+    </w:lvl>
+    <w:lvl w:ilvl="4" w:tplc="04160019" w:tentative="1">
+      <w:start w:val="1"/>
+      <w:numFmt w:val="lowerLetter"/>
+      <w:lvlText w:val="%5."/>
+      <w:lvlJc w:val="left"/>
+      <w:pPr>
+        <w:ind w:left="3600" w:hanging="360"/>
+      </w:pPr>
+    </w:lvl>
+    <w:lvl w:ilvl="5" w:tplc="0416001B" w:tentative="1">
+      <w:start w:val="1"/>
+      <w:numFmt w:val="lowerRoman"/>
+      <w:lvlText w:val="%6."/>
+      <w:lvlJc w:val="right"/>
+      <w:pPr>
+        <w:ind w:left="4320" w:hanging="180"/>
+      </w:pPr>
+    </w:lvl>
+    <w:lvl w:ilvl="6" w:tplc="0416000F" w:tentative="1">
+      <w:start w:val="1"/>
+      <w:numFmt w:val="decimal"/>
+      <w:lvlText w:val="%7."/>
+      <w:lvlJc w:val="left"/>
+      <w:pPr>
+        <w:ind w:left="5040" w:hanging="360"/>
+      </w:pPr>
+    </w:lvl>
+    <w:lvl w:ilvl="7" w:tplc="04160019" w:tentative="1">
+      <w:start w:val="1"/>
+      <w:numFmt w:val="lowerLetter"/>
+      <w:lvlText w:val="%8."/>
+      <w:lvlJc w:val="left"/>
+      <w:pPr>
+        <w:ind w:left="5760" w:hanging="360"/>
+      </w:pPr>
+    </w:lvl>
+    <w:lvl w:ilvl="8" w:tplc="0416001B" w:tentative="1">
+      <w:start w:val="1"/>
+      <w:numFmt w:val="lowerRoman"/>
+      <w:lvlText w:val="%9."/>
+      <w:lvlJc w:val="right"/>
+      <w:pPr>
+        <w:ind w:left="6480" w:hanging="180"/>
+      </w:pPr>
+    </w:lvl>
+  </w:abstractNum>
+  <w:abstractNum w:abstractNumId="5" w15:restartNumberingAfterBreak="0">
     <w:nsid w:val="2E024BD6"/>
     <w:multiLevelType w:val="hybridMultilevel"/>
     <w:tmpl w:val="3626A494"/>
@@ -57310,7 +55591,7 @@
       </w:pPr>
     </w:lvl>
   </w:abstractNum>
-  <w:abstractNum w:abstractNumId="5" w15:restartNumberingAfterBreak="0">
+  <w:abstractNum w:abstractNumId="6" w15:restartNumberingAfterBreak="0">
     <w:nsid w:val="6D924AB8"/>
     <w:multiLevelType w:val="hybridMultilevel"/>
     <w:tmpl w:val="2EFA7BFA"/>
@@ -57399,7 +55680,7 @@
       </w:pPr>
     </w:lvl>
   </w:abstractNum>
-  <w:abstractNum w:abstractNumId="6" w15:restartNumberingAfterBreak="0">
+  <w:abstractNum w:abstractNumId="7" w15:restartNumberingAfterBreak="0">
     <w:nsid w:val="7EBB2D87"/>
     <w:multiLevelType w:val="hybridMultilevel"/>
     <w:tmpl w:val="82E04786"/>
@@ -57486,7 +55767,7 @@
     </w:lvl>
   </w:abstractNum>
   <w:num w:numId="1" w16cid:durableId="1434934599">
-    <w:abstractNumId w:val="6"/>
+    <w:abstractNumId w:val="7"/>
     <w:lvlOverride w:ilvl="0">
       <w:startOverride w:val="1"/>
     </w:lvlOverride>
@@ -57501,7 +55782,7 @@
     <w:abstractNumId w:val="3"/>
   </w:num>
   <w:num w:numId="4" w16cid:durableId="1816987979">
-    <w:abstractNumId w:val="4"/>
+    <w:abstractNumId w:val="5"/>
   </w:num>
   <w:num w:numId="5" w16cid:durableId="1583249964">
     <w:abstractNumId w:val="2"/>
@@ -57510,7 +55791,10 @@
     <w:abstractNumId w:val="1"/>
   </w:num>
   <w:num w:numId="7" w16cid:durableId="1513186597">
-    <w:abstractNumId w:val="5"/>
+    <w:abstractNumId w:val="6"/>
+  </w:num>
+  <w:num w:numId="8" w16cid:durableId="437139884">
+    <w:abstractNumId w:val="4"/>
   </w:num>
 </w:numbering>
 </file>

</xml_diff>